<commit_message>
Regenerate the API documentation DOCX and PDF
Render version 1.1 with its diagrams.
</commit_message>
<xml_diff>
--- a/docs/SmartPot_API_Documentation.docx
+++ b/docs/SmartPot_API_Documentation.docx
@@ -359,7 +359,7 @@
                 <w:sz w:val="19"/>
                 <w:szCs w:val="19"/>
               </w:rPr>
-              <w:t xml:space="preserve">1.0 · septiembre 2026</w:t>
+              <w:t xml:space="preserve">1.1 · octubre 2026</w:t>
             </w:r>
             <w:r>
               <w:rPr>
@@ -729,7 +729,7 @@
                 <w:sz w:val="17"/>
                 <w:szCs w:val="17"/>
               </w:rPr>
-              <w:t xml:space="preserve">1.0 · septiembre 2026</w:t>
+              <w:t xml:space="preserve">1.1 · octubre 2026</w:t>
             </w:r>
           </w:p>
         </w:tc>
@@ -1570,7 +1570,7 @@
                 <w:sz w:val="17"/>
                 <w:szCs w:val="17"/>
               </w:rPr>
-              <w:t xml:space="preserve">Reales o virtuales (se elige al crear y no cambia), seis especies, cuatro formas y modo automático</w:t>
+              <w:t xml:space="preserve">Reales o virtuales (se elige al crear y no cambia), seis especies, cuatro formas, su lugar con el clima de afuera y modo automático</w:t>
             </w:r>
           </w:p>
         </w:tc>
@@ -1747,7 +1747,7 @@
                 <w:sz w:val="17"/>
                 <w:szCs w:val="17"/>
               </w:rPr>
-              <w:t xml:space="preserve">Comandos con QoS 1, confirmación del dispositivo, vencimiento y órdenes en bloque</w:t>
+              <w:t xml:space="preserve">Actuadores como switches (409 si la orden no cambia nada o se cruza con otra), comandos con QoS 1, confirmación del dispositivo, vencimiento y órdenes en bloque</w:t>
             </w:r>
           </w:p>
         </w:tc>
@@ -1924,7 +1924,7 @@
                 <w:sz w:val="17"/>
                 <w:szCs w:val="17"/>
               </w:rPr>
-              <w:t xml:space="preserve">Notificaciones en la PWA y en Telegram, con canales intercambiables</w:t>
+              <w:t xml:space="preserve">Notificaciones en la PWA y en Telegram, con canales intercambiables, avisos por cultivo, resúmenes y chats compartidos</w:t>
             </w:r>
           </w:p>
         </w:tc>
@@ -2163,7 +2163,7 @@
       <w:r>
         <w:drawing>
           <wp:inline distT="0" distB="0" distL="0" distR="0">
-            <wp:extent cx="8229600" cy="3222410"/>
+            <wp:extent cx="8229600" cy="2619132"/>
             <wp:docPr id="107" name="SmartPot_API_Global_Component"/>
             <wp:cNvGraphicFramePr>
               <a:graphicFrameLocks noChangeAspect="1"/>
@@ -2184,7 +2184,7 @@
                   <pic:spPr>
                     <a:xfrm>
                       <a:off x="0" y="0"/>
-                      <a:ext cx="8229600" cy="3222410"/>
+                      <a:ext cx="8229600" cy="2619132"/>
                     </a:xfrm>
                     <a:prstGeom prst="rect">
                       <a:avLst/>
@@ -2236,6 +2236,932 @@
           <w:pgMar w:top="1700" w:right="1440" w:bottom="1440" w:left="1440" w:header="700" w:footer="620" w:gutter="0"/>
           <w:cols w:space="720"/>
         </w:sectPr>
+      </w:pPr>
+    </w:p>
+    <w:p>
+      <w:pPr>
+        <w:spacing w:before="80" w:after="0" w:line="240" w:lineRule="auto"/>
+        <w:rPr>
+          <w:sz w:val="8"/>
+        </w:rPr>
+      </w:pPr>
+    </w:p>
+    <w:tbl>
+      <w:tblPr>
+        <w:tblW w:w="9360" w:type="dxa"/>
+        <w:tblInd w:w="0" w:type="dxa"/>
+        <w:tblBorders>
+          <w:top w:val="nil"/>
+          <w:left w:val="nil"/>
+          <w:bottom w:val="nil"/>
+          <w:right w:val="nil"/>
+          <w:insideH w:val="nil"/>
+          <w:insideV w:val="nil"/>
+        </w:tblBorders>
+        <w:tblLayout w:type="fixed"/>
+        <w:tblCellMar>
+          <w:left w:w="0" w:type="dxa"/>
+          <w:right w:w="0" w:type="dxa"/>
+        </w:tblCellMar>
+        <w:tblLook w:val="0000" w:firstRow="0" w:lastRow="0" w:firstColumn="0" w:lastColumn="0" w:noHBand="1" w:noVBand="1"/>
+      </w:tblPr>
+      <w:tblGrid>
+        <w:gridCol w:w="9360"/>
+      </w:tblGrid>
+      <w:tr>
+        <w:trPr>
+          <w:cantSplit/>
+        </w:trPr>
+        <w:tc>
+          <w:tcPr>
+            <w:tcW w:w="9360" w:type="dxa"/>
+            <w:shd w:val="clear" w:color="auto" w:fill="0B3D2B"/>
+            <w:tcMar>
+              <w:top w:w="60" w:type="dxa"/>
+              <w:left w:w="200" w:type="dxa"/>
+              <w:bottom w:w="60" w:type="dxa"/>
+              <w:right w:w="200" w:type="dxa"/>
+            </w:tcMar>
+            <w:vAlign w:val="top"/>
+          </w:tcPr>
+          <w:p>
+            <w:pPr>
+              <w:spacing w:before="0" w:after="0" w:line="240" w:lineRule="auto"/>
+            </w:pPr>
+            <w:r>
+              <w:rPr>
+                <w:b/>
+                <w:bCs/>
+                <w:color w:val="7FDBB0"/>
+                <w:spacing w:val="40"/>
+                <w:sz w:val="14"/>
+                <w:szCs w:val="14"/>
+              </w:rPr>
+              <w:t xml:space="preserve">MERMAID</w:t>
+            </w:r>
+          </w:p>
+        </w:tc>
+      </w:tr>
+    </w:tbl>
+    <w:tbl>
+      <w:tblPr>
+        <w:tblW w:w="9360" w:type="dxa"/>
+        <w:tblInd w:w="0" w:type="dxa"/>
+        <w:tblBorders>
+          <w:top w:val="nil"/>
+          <w:left w:val="nil"/>
+          <w:bottom w:val="nil"/>
+          <w:right w:val="nil"/>
+          <w:insideH w:val="nil"/>
+          <w:insideV w:val="nil"/>
+        </w:tblBorders>
+        <w:tblLayout w:type="fixed"/>
+        <w:tblCellMar>
+          <w:left w:w="0" w:type="dxa"/>
+          <w:right w:w="0" w:type="dxa"/>
+        </w:tblCellMar>
+        <w:tblLook w:val="0000" w:firstRow="0" w:lastRow="0" w:firstColumn="0" w:lastColumn="0" w:noHBand="1" w:noVBand="1"/>
+      </w:tblPr>
+      <w:tblGrid>
+        <w:gridCol w:w="9360"/>
+      </w:tblGrid>
+      <w:tr>
+        <w:trPr>
+          <w:cantSplit/>
+        </w:trPr>
+        <w:tc>
+          <w:tcPr>
+            <w:tcW w:w="9360" w:type="dxa"/>
+            <w:shd w:val="clear" w:color="auto" w:fill="F7FAF8"/>
+            <w:tcMar>
+              <w:top w:w="120" w:type="dxa"/>
+              <w:left w:w="200" w:type="dxa"/>
+              <w:bottom w:w="120" w:type="dxa"/>
+              <w:right w:w="200" w:type="dxa"/>
+            </w:tcMar>
+            <w:vAlign w:val="top"/>
+          </w:tcPr>
+          <w:p>
+            <w:pPr>
+              <w:spacing w:before="0" w:after="0" w:line="252" w:lineRule="auto"/>
+            </w:pPr>
+            <w:r>
+              <w:rPr>
+                <w:rFonts w:ascii="JetBrains Mono" w:hAnsi="JetBrains Mono" w:eastAsia="JetBrains Mono" w:cs="JetBrains Mono"/>
+                <w:color w:val="17261F"/>
+                <w:sz w:val="16"/>
+                <w:szCs w:val="16"/>
+              </w:rPr>
+              <w:t xml:space="preserve">%%{init: {"theme": "base", "fontFamily": "Segoe UI, Arial, sans-serif", "themeVariables": {"fontFamily": "Segoe UI, Arial, sans-serif", "fontSize": "15px", "primaryColor": "#DDF5EA", "primaryTextColor": "#17261F", "primaryBorderColor": "#067A52", "secondaryColor": "#E3F2FB", "secondaryTextColor": "#17261F", "secondaryBorderColor": "#1F6FA0", "tertiaryColor": "#F2F7F4", "tertiaryTextColor": "#17261F", "tertiaryBorderColor": "#D5E3DC", "lineColor": "#5B6B63", "textColor": "#17261F", "mainBkg": "#DDF5EA", "nodeBorder": "#067A52", "clusterBkg": "#F7FAF8", "clusterBorder": "#D5E3DC", "edgeLabelBackground": "#FFFFFF", "actorBkg": "#067A52", "actorBorder": "#0B3D2B", "actorTextColor": "#FFFFFF", "actorLineColor": "#5B6B63", "signalColor": "#17261F", "signalTextColor": "#17261F", "labelBoxBkgColor": "#0B3D2B", "labelBoxBorderColor": "#0B3D2B", "labelTextColor": "#FFFFFF", "loopTextColor": "#0B3D2B", "noteBkgColor": "#FDF4DD", "noteBorderColor": "#C98D12", "noteTextColor": "#17261F", "activationBkgColor": "#DDF5EA", "activationBorderColor": "#067A52", "attributeBackgroundColorOdd": "#FFFFFF", "attributeBackgroundColorEven": "#F2F7F4"}, "layout": "elk", "elk": {"nodePlacementStrategy": "BRANDES_KOEPF", "mergeEdges": false, "cycleBreakingStrategy": "GREEDY"}}}%%</w:t>
+            </w:r>
+          </w:p>
+          <w:p>
+            <w:pPr>
+              <w:spacing w:before="0" w:after="0" w:line="252" w:lineRule="auto"/>
+            </w:pPr>
+            <w:r>
+              <w:rPr>
+                <w:rFonts w:ascii="JetBrains Mono" w:hAnsi="JetBrains Mono" w:eastAsia="JetBrains Mono" w:cs="JetBrains Mono"/>
+                <w:color w:val="17261F"/>
+                <w:sz w:val="16"/>
+                <w:szCs w:val="16"/>
+              </w:rPr>
+              <w:t xml:space="preserve">flowchart LR</w:t>
+            </w:r>
+          </w:p>
+          <w:p>
+            <w:pPr>
+              <w:spacing w:before="0" w:after="0" w:line="252" w:lineRule="auto"/>
+            </w:pPr>
+            <w:r>
+              <w:rPr>
+                <w:rFonts w:ascii="JetBrains Mono" w:hAnsi="JetBrains Mono" w:eastAsia="JetBrains Mono" w:cs="JetBrains Mono"/>
+                <w:color w:val="17261F"/>
+                <w:sz w:val="16"/>
+                <w:szCs w:val="16"/>
+              </w:rPr>
+              <w:t xml:space="preserve">  pwa["SmartPot-Web&lt;br/&gt;PWA"]</w:t>
+            </w:r>
+          </w:p>
+          <w:p>
+            <w:pPr>
+              <w:spacing w:before="0" w:after="0" w:line="252" w:lineRule="auto"/>
+            </w:pPr>
+            <w:r>
+              <w:rPr>
+                <w:rFonts w:ascii="JetBrains Mono" w:hAnsi="JetBrains Mono" w:eastAsia="JetBrains Mono" w:cs="JetBrains Mono"/>
+                <w:color w:val="17261F"/>
+                <w:sz w:val="16"/>
+                <w:szCs w:val="16"/>
+              </w:rPr>
+              <w:t xml:space="preserve">  tg["Telegram"]</w:t>
+            </w:r>
+          </w:p>
+          <w:p>
+            <w:pPr>
+              <w:spacing w:before="0" w:after="0" w:line="252" w:lineRule="auto"/>
+            </w:pPr>
+            <w:r>
+              <w:rPr>
+                <w:rFonts w:ascii="JetBrains Mono" w:hAnsi="JetBrains Mono" w:eastAsia="JetBrains Mono" w:cs="JetBrains Mono"/>
+                <w:color w:val="17261F"/>
+                <w:sz w:val="16"/>
+                <w:szCs w:val="16"/>
+              </w:rPr>
+              <w:t xml:space="preserve">  subgraph borde["Entrada HTTP"]</w:t>
+            </w:r>
+          </w:p>
+          <w:p>
+            <w:pPr>
+              <w:spacing w:before="0" w:after="0" w:line="252" w:lineRule="auto"/>
+            </w:pPr>
+            <w:r>
+              <w:rPr>
+                <w:rFonts w:ascii="JetBrains Mono" w:hAnsi="JetBrains Mono" w:eastAsia="JetBrains Mono" w:cs="JetBrains Mono"/>
+                <w:color w:val="17261F"/>
+                <w:sz w:val="16"/>
+                <w:szCs w:val="16"/>
+              </w:rPr>
+              <w:t xml:space="preserve">    direction TB</w:t>
+            </w:r>
+          </w:p>
+          <w:p>
+            <w:pPr>
+              <w:spacing w:before="0" w:after="0" w:line="252" w:lineRule="auto"/>
+            </w:pPr>
+            <w:r>
+              <w:rPr>
+                <w:rFonts w:ascii="JetBrains Mono" w:hAnsi="JetBrains Mono" w:eastAsia="JetBrains Mono" w:cs="JetBrains Mono"/>
+                <w:color w:val="17261F"/>
+                <w:sz w:val="16"/>
+                <w:szCs w:val="16"/>
+              </w:rPr>
+              <w:t xml:space="preserve">    sec["SecurityConfiguration&lt;br/&gt;CORS · JWT · rutas públicas"]</w:t>
+            </w:r>
+          </w:p>
+          <w:p>
+            <w:pPr>
+              <w:spacing w:before="0" w:after="0" w:line="252" w:lineRule="auto"/>
+            </w:pPr>
+            <w:r>
+              <w:rPr>
+                <w:rFonts w:ascii="JetBrains Mono" w:hAnsi="JetBrains Mono" w:eastAsia="JetBrains Mono" w:cs="JetBrains Mono"/>
+                <w:color w:val="17261F"/>
+                <w:sz w:val="16"/>
+                <w:szCs w:val="16"/>
+              </w:rPr>
+              <w:t xml:space="preserve">    rate["RateLimitingFilter&lt;br/&gt;300/min por IP · 10/min en auth"]</w:t>
+            </w:r>
+          </w:p>
+          <w:p>
+            <w:pPr>
+              <w:spacing w:before="0" w:after="0" w:line="252" w:lineRule="auto"/>
+            </w:pPr>
+            <w:r>
+              <w:rPr>
+                <w:rFonts w:ascii="JetBrains Mono" w:hAnsi="JetBrains Mono" w:eastAsia="JetBrains Mono" w:cs="JetBrains Mono"/>
+                <w:color w:val="17261F"/>
+                <w:sz w:val="16"/>
+                <w:szCs w:val="16"/>
+              </w:rPr>
+              <w:t xml:space="preserve">  end</w:t>
+            </w:r>
+          </w:p>
+          <w:p>
+            <w:pPr>
+              <w:spacing w:before="0" w:after="0" w:line="252" w:lineRule="auto"/>
+            </w:pPr>
+            <w:r>
+              <w:rPr>
+                <w:rFonts w:ascii="JetBrains Mono" w:hAnsi="JetBrains Mono" w:eastAsia="JetBrains Mono" w:cs="JetBrains Mono"/>
+                <w:color w:val="17261F"/>
+                <w:sz w:val="16"/>
+                <w:szCs w:val="16"/>
+              </w:rPr>
+              <w:t xml:space="preserve">  subgraph dominio["Dominios · controller → service → repository"]</w:t>
+            </w:r>
+          </w:p>
+          <w:p>
+            <w:pPr>
+              <w:spacing w:before="0" w:after="0" w:line="252" w:lineRule="auto"/>
+            </w:pPr>
+            <w:r>
+              <w:rPr>
+                <w:rFonts w:ascii="JetBrains Mono" w:hAnsi="JetBrains Mono" w:eastAsia="JetBrains Mono" w:cs="JetBrains Mono"/>
+                <w:color w:val="17261F"/>
+                <w:sz w:val="16"/>
+                <w:szCs w:val="16"/>
+              </w:rPr>
+              <w:t xml:space="preserve">    direction TB</w:t>
+            </w:r>
+          </w:p>
+          <w:p>
+            <w:pPr>
+              <w:spacing w:before="0" w:after="0" w:line="252" w:lineRule="auto"/>
+            </w:pPr>
+            <w:r>
+              <w:rPr>
+                <w:rFonts w:ascii="JetBrains Mono" w:hAnsi="JetBrains Mono" w:eastAsia="JetBrains Mono" w:cs="JetBrains Mono"/>
+                <w:color w:val="17261F"/>
+                <w:sz w:val="16"/>
+                <w:szCs w:val="16"/>
+              </w:rPr>
+              <w:t xml:space="preserve">    auth["security · users&lt;br/&gt;AuthService · UserService"]</w:t>
+            </w:r>
+          </w:p>
+          <w:p>
+            <w:pPr>
+              <w:spacing w:before="0" w:after="0" w:line="252" w:lineRule="auto"/>
+            </w:pPr>
+            <w:r>
+              <w:rPr>
+                <w:rFonts w:ascii="JetBrains Mono" w:hAnsi="JetBrains Mono" w:eastAsia="JetBrains Mono" w:cs="JetBrains Mono"/>
+                <w:color w:val="17261F"/>
+                <w:sz w:val="16"/>
+                <w:szCs w:val="16"/>
+              </w:rPr>
+              <w:t xml:space="preserve">    crops["crops&lt;br/&gt;CropService · real o virtual&lt;br/&gt;forma · lugar · clave del dispositivo&lt;br/&gt;CropWeatherService"]</w:t>
+            </w:r>
+          </w:p>
+          <w:p>
+            <w:pPr>
+              <w:spacing w:before="0" w:after="0" w:line="252" w:lineRule="auto"/>
+            </w:pPr>
+            <w:r>
+              <w:rPr>
+                <w:rFonts w:ascii="JetBrains Mono" w:hAnsi="JetBrains Mono" w:eastAsia="JetBrains Mono" w:cs="JetBrains Mono"/>
+                <w:color w:val="17261F"/>
+                <w:sz w:val="16"/>
+                <w:szCs w:val="16"/>
+              </w:rPr>
+              <w:t xml:space="preserve">    readings["readings&lt;br/&gt;ReadingService · MeasureRanges"]</w:t>
+            </w:r>
+          </w:p>
+          <w:p>
+            <w:pPr>
+              <w:spacing w:before="0" w:after="0" w:line="252" w:lineRule="auto"/>
+            </w:pPr>
+            <w:r>
+              <w:rPr>
+                <w:rFonts w:ascii="JetBrains Mono" w:hAnsi="JetBrains Mono" w:eastAsia="JetBrains Mono" w:cs="JetBrains Mono"/>
+                <w:color w:val="17261F"/>
+                <w:sz w:val="16"/>
+                <w:szCs w:val="16"/>
+              </w:rPr>
+              <w:t xml:space="preserve">    actuators["actuators · commands&lt;br/&gt;ActuatorService · CommandService&lt;br/&gt;switches · 409 si no cambia nada"]</w:t>
+            </w:r>
+          </w:p>
+          <w:p>
+            <w:pPr>
+              <w:spacing w:before="0" w:after="0" w:line="252" w:lineRule="auto"/>
+            </w:pPr>
+            <w:r>
+              <w:rPr>
+                <w:rFonts w:ascii="JetBrains Mono" w:hAnsi="JetBrains Mono" w:eastAsia="JetBrains Mono" w:cs="JetBrains Mono"/>
+                <w:color w:val="17261F"/>
+                <w:sz w:val="16"/>
+                <w:szCs w:val="16"/>
+              </w:rPr>
+              <w:t xml:space="preserve">    overview["overview&lt;br/&gt;totales · series · flota"]</w:t>
+            </w:r>
+          </w:p>
+          <w:p>
+            <w:pPr>
+              <w:spacing w:before="0" w:after="0" w:line="252" w:lineRule="auto"/>
+            </w:pPr>
+            <w:r>
+              <w:rPr>
+                <w:rFonts w:ascii="JetBrains Mono" w:hAnsi="JetBrains Mono" w:eastAsia="JetBrains Mono" w:cs="JetBrains Mono"/>
+                <w:color w:val="17261F"/>
+                <w:sz w:val="16"/>
+                <w:szCs w:val="16"/>
+              </w:rPr>
+              <w:t xml:space="preserve">    notif["notifications · channels&lt;br/&gt;ChannelDispatcher · TelegramBot&lt;br/&gt;CropChannelService · CropChannelDigest"]</w:t>
+            </w:r>
+          </w:p>
+          <w:p>
+            <w:pPr>
+              <w:spacing w:before="0" w:after="0" w:line="252" w:lineRule="auto"/>
+            </w:pPr>
+            <w:r>
+              <w:rPr>
+                <w:rFonts w:ascii="JetBrains Mono" w:hAnsi="JetBrains Mono" w:eastAsia="JetBrains Mono" w:cs="JetBrains Mono"/>
+                <w:color w:val="17261F"/>
+                <w:sz w:val="16"/>
+                <w:szCs w:val="16"/>
+              </w:rPr>
+              <w:t xml:space="preserve">    virtual["virtualdevices&lt;br/&gt;VirtualDeviceService · SimulatorClient&lt;br/&gt;CropKindBackfill"]</w:t>
+            </w:r>
+          </w:p>
+          <w:p>
+            <w:pPr>
+              <w:spacing w:before="0" w:after="0" w:line="252" w:lineRule="auto"/>
+            </w:pPr>
+            <w:r>
+              <w:rPr>
+                <w:rFonts w:ascii="JetBrains Mono" w:hAnsi="JetBrains Mono" w:eastAsia="JetBrains Mono" w:cs="JetBrains Mono"/>
+                <w:color w:val="17261F"/>
+                <w:sz w:val="16"/>
+                <w:szCs w:val="16"/>
+              </w:rPr>
+              <w:t xml:space="preserve">    ai["ai&lt;br/&gt;AutomationAgent · LearningFeed&lt;br/&gt;InsightService · AiClient"]</w:t>
+            </w:r>
+          </w:p>
+          <w:p>
+            <w:pPr>
+              <w:spacing w:before="0" w:after="0" w:line="252" w:lineRule="auto"/>
+            </w:pPr>
+            <w:r>
+              <w:rPr>
+                <w:rFonts w:ascii="JetBrains Mono" w:hAnsi="JetBrains Mono" w:eastAsia="JetBrains Mono" w:cs="JetBrains Mono"/>
+                <w:color w:val="17261F"/>
+                <w:sz w:val="16"/>
+                <w:szCs w:val="16"/>
+              </w:rPr>
+              <w:t xml:space="preserve">  end</w:t>
+            </w:r>
+          </w:p>
+          <w:p>
+            <w:pPr>
+              <w:spacing w:before="0" w:after="0" w:line="252" w:lineRule="auto"/>
+            </w:pPr>
+            <w:r>
+              <w:rPr>
+                <w:rFonts w:ascii="JetBrains Mono" w:hAnsi="JetBrains Mono" w:eastAsia="JetBrains Mono" w:cs="JetBrains Mono"/>
+                <w:color w:val="17261F"/>
+                <w:sz w:val="16"/>
+                <w:szCs w:val="16"/>
+              </w:rPr>
+              <w:t xml:space="preserve">  subgraph mqtt["mqtt"]</w:t>
+            </w:r>
+          </w:p>
+          <w:p>
+            <w:pPr>
+              <w:spacing w:before="0" w:after="0" w:line="252" w:lineRule="auto"/>
+            </w:pPr>
+            <w:r>
+              <w:rPr>
+                <w:rFonts w:ascii="JetBrains Mono" w:hAnsi="JetBrains Mono" w:eastAsia="JetBrains Mono" w:cs="JetBrains Mono"/>
+                <w:color w:val="17261F"/>
+                <w:sz w:val="16"/>
+                <w:szCs w:val="16"/>
+              </w:rPr>
+              <w:t xml:space="preserve">    direction TB</w:t>
+            </w:r>
+          </w:p>
+          <w:p>
+            <w:pPr>
+              <w:spacing w:before="0" w:after="0" w:line="252" w:lineRule="auto"/>
+            </w:pPr>
+            <w:r>
+              <w:rPr>
+                <w:rFonts w:ascii="JetBrains Mono" w:hAnsi="JetBrains Mono" w:eastAsia="JetBrains Mono" w:cs="JetBrains Mono"/>
+                <w:color w:val="17261F"/>
+                <w:sz w:val="16"/>
+                <w:szCs w:val="16"/>
+              </w:rPr>
+              <w:t xml:space="preserve">    gateway["PahoMqttGateway&lt;br/&gt;MqttMessageHandler · TelemetryParser"]</w:t>
+            </w:r>
+          </w:p>
+          <w:p>
+            <w:pPr>
+              <w:spacing w:before="0" w:after="0" w:line="252" w:lineRule="auto"/>
+            </w:pPr>
+            <w:r>
+              <w:rPr>
+                <w:rFonts w:ascii="JetBrains Mono" w:hAnsi="JetBrains Mono" w:eastAsia="JetBrains Mono" w:cs="JetBrains Mono"/>
+                <w:color w:val="17261F"/>
+                <w:sz w:val="16"/>
+                <w:szCs w:val="16"/>
+              </w:rPr>
+              <w:t xml:space="preserve">    prov["DeviceProvisioner&lt;br/&gt;seguridad dinámica"]</w:t>
+            </w:r>
+          </w:p>
+          <w:p>
+            <w:pPr>
+              <w:spacing w:before="0" w:after="0" w:line="252" w:lineRule="auto"/>
+            </w:pPr>
+            <w:r>
+              <w:rPr>
+                <w:rFonts w:ascii="JetBrains Mono" w:hAnsi="JetBrains Mono" w:eastAsia="JetBrains Mono" w:cs="JetBrains Mono"/>
+                <w:color w:val="17261F"/>
+                <w:sz w:val="16"/>
+                <w:szCs w:val="16"/>
+              </w:rPr>
+              <w:t xml:space="preserve">  end</w:t>
+            </w:r>
+          </w:p>
+          <w:p>
+            <w:pPr>
+              <w:spacing w:before="0" w:after="0" w:line="252" w:lineRule="auto"/>
+            </w:pPr>
+            <w:r>
+              <w:rPr>
+                <w:rFonts w:ascii="JetBrains Mono" w:hAnsi="JetBrains Mono" w:eastAsia="JetBrains Mono" w:cs="JetBrains Mono"/>
+                <w:color w:val="17261F"/>
+                <w:sz w:val="16"/>
+                <w:szCs w:val="16"/>
+              </w:rPr>
+              <w:t xml:space="preserve">  mongo[("MongoDB")]</w:t>
+            </w:r>
+          </w:p>
+          <w:p>
+            <w:pPr>
+              <w:spacing w:before="0" w:after="0" w:line="252" w:lineRule="auto"/>
+            </w:pPr>
+            <w:r>
+              <w:rPr>
+                <w:rFonts w:ascii="JetBrains Mono" w:hAnsi="JetBrains Mono" w:eastAsia="JetBrains Mono" w:cs="JetBrains Mono"/>
+                <w:color w:val="17261F"/>
+                <w:sz w:val="16"/>
+                <w:szCs w:val="16"/>
+              </w:rPr>
+              <w:t xml:space="preserve">  redis[("Redis&lt;br/&gt;CacheStore")]</w:t>
+            </w:r>
+          </w:p>
+          <w:p>
+            <w:pPr>
+              <w:spacing w:before="0" w:after="0" w:line="252" w:lineRule="auto"/>
+            </w:pPr>
+            <w:r>
+              <w:rPr>
+                <w:rFonts w:ascii="JetBrains Mono" w:hAnsi="JetBrains Mono" w:eastAsia="JetBrains Mono" w:cs="JetBrains Mono"/>
+                <w:color w:val="17261F"/>
+                <w:sz w:val="16"/>
+                <w:szCs w:val="16"/>
+              </w:rPr>
+              <w:t xml:space="preserve">  broker["SmartPot-Broker"]</w:t>
+            </w:r>
+          </w:p>
+          <w:p>
+            <w:pPr>
+              <w:spacing w:before="0" w:after="0" w:line="252" w:lineRule="auto"/>
+            </w:pPr>
+            <w:r>
+              <w:rPr>
+                <w:rFonts w:ascii="JetBrains Mono" w:hAnsi="JetBrains Mono" w:eastAsia="JetBrains Mono" w:cs="JetBrains Mono"/>
+                <w:color w:val="17261F"/>
+                <w:sz w:val="16"/>
+                <w:szCs w:val="16"/>
+              </w:rPr>
+              <w:t xml:space="preserve">  aisvc["SmartPot-AI"]</w:t>
+            </w:r>
+          </w:p>
+          <w:p>
+            <w:pPr>
+              <w:spacing w:before="0" w:after="0" w:line="252" w:lineRule="auto"/>
+            </w:pPr>
+            <w:r>
+              <w:rPr>
+                <w:rFonts w:ascii="JetBrains Mono" w:hAnsi="JetBrains Mono" w:eastAsia="JetBrains Mono" w:cs="JetBrains Mono"/>
+                <w:color w:val="17261F"/>
+                <w:sz w:val="16"/>
+                <w:szCs w:val="16"/>
+              </w:rPr>
+              <w:t xml:space="preserve">  sim["SmartPot-DataGenerator"]</w:t>
+            </w:r>
+          </w:p>
+          <w:p>
+            <w:pPr>
+              <w:spacing w:before="0" w:after="0" w:line="252" w:lineRule="auto"/>
+            </w:pPr>
+            <w:r>
+              <w:rPr>
+                <w:rFonts w:ascii="JetBrains Mono" w:hAnsi="JetBrains Mono" w:eastAsia="JetBrains Mono" w:cs="JetBrains Mono"/>
+                <w:color w:val="17261F"/>
+                <w:sz w:val="16"/>
+                <w:szCs w:val="16"/>
+              </w:rPr>
+              <w:t xml:space="preserve">  smtp["SMTP&lt;br/&gt;MailService"]</w:t>
+            </w:r>
+          </w:p>
+          <w:p>
+            <w:pPr>
+              <w:spacing w:before="0" w:after="0" w:line="252" w:lineRule="auto"/>
+            </w:pPr>
+            <w:r>
+              <w:rPr>
+                <w:rFonts w:ascii="JetBrains Mono" w:hAnsi="JetBrains Mono" w:eastAsia="JetBrains Mono" w:cs="JetBrains Mono"/>
+                <w:color w:val="17261F"/>
+                <w:sz w:val="16"/>
+                <w:szCs w:val="16"/>
+              </w:rPr>
+              <w:t xml:space="preserve">  pwa --&gt;|"REST + JWT"| rate --&gt; sec --&gt; dominio</w:t>
+            </w:r>
+          </w:p>
+          <w:p>
+            <w:pPr>
+              <w:spacing w:before="0" w:after="0" w:line="252" w:lineRule="auto"/>
+            </w:pPr>
+            <w:r>
+              <w:rPr>
+                <w:rFonts w:ascii="JetBrains Mono" w:hAnsi="JetBrains Mono" w:eastAsia="JetBrains Mono" w:cs="JetBrains Mono"/>
+                <w:color w:val="17261F"/>
+                <w:sz w:val="16"/>
+                <w:szCs w:val="16"/>
+              </w:rPr>
+              <w:t xml:space="preserve">  tg --&gt;|"webhook firmado o sondeo"| notif</w:t>
+            </w:r>
+          </w:p>
+          <w:p>
+            <w:pPr>
+              <w:spacing w:before="0" w:after="0" w:line="252" w:lineRule="auto"/>
+            </w:pPr>
+            <w:r>
+              <w:rPr>
+                <w:rFonts w:ascii="JetBrains Mono" w:hAnsi="JetBrains Mono" w:eastAsia="JetBrains Mono" w:cs="JetBrains Mono"/>
+                <w:color w:val="17261F"/>
+                <w:sz w:val="16"/>
+                <w:szCs w:val="16"/>
+              </w:rPr>
+              <w:t xml:space="preserve">  notif --&gt;|"Bot API"| tg</w:t>
+            </w:r>
+          </w:p>
+          <w:p>
+            <w:pPr>
+              <w:spacing w:before="0" w:after="0" w:line="252" w:lineRule="auto"/>
+            </w:pPr>
+            <w:r>
+              <w:rPr>
+                <w:rFonts w:ascii="JetBrains Mono" w:hAnsi="JetBrains Mono" w:eastAsia="JetBrains Mono" w:cs="JetBrains Mono"/>
+                <w:color w:val="17261F"/>
+                <w:sz w:val="16"/>
+                <w:szCs w:val="16"/>
+              </w:rPr>
+              <w:t xml:space="preserve">  dominio --&gt; mongo</w:t>
+            </w:r>
+          </w:p>
+          <w:p>
+            <w:pPr>
+              <w:spacing w:before="0" w:after="0" w:line="252" w:lineRule="auto"/>
+            </w:pPr>
+            <w:r>
+              <w:rPr>
+                <w:rFonts w:ascii="JetBrains Mono" w:hAnsi="JetBrains Mono" w:eastAsia="JetBrains Mono" w:cs="JetBrains Mono"/>
+                <w:color w:val="17261F"/>
+                <w:sz w:val="16"/>
+                <w:szCs w:val="16"/>
+              </w:rPr>
+              <w:t xml:space="preserve">  rate &amp; readings &amp; ai --&gt; redis</w:t>
+            </w:r>
+          </w:p>
+          <w:p>
+            <w:pPr>
+              <w:spacing w:before="0" w:after="0" w:line="252" w:lineRule="auto"/>
+            </w:pPr>
+            <w:r>
+              <w:rPr>
+                <w:rFonts w:ascii="JetBrains Mono" w:hAnsi="JetBrains Mono" w:eastAsia="JetBrains Mono" w:cs="JetBrains Mono"/>
+                <w:color w:val="17261F"/>
+                <w:sz w:val="16"/>
+                <w:szCs w:val="16"/>
+              </w:rPr>
+              <w:t xml:space="preserve">  auth --&gt; smtp</w:t>
+            </w:r>
+          </w:p>
+          <w:p>
+            <w:pPr>
+              <w:spacing w:before="0" w:after="0" w:line="252" w:lineRule="auto"/>
+            </w:pPr>
+            <w:r>
+              <w:rPr>
+                <w:rFonts w:ascii="JetBrains Mono" w:hAnsi="JetBrains Mono" w:eastAsia="JetBrains Mono" w:cs="JetBrains Mono"/>
+                <w:color w:val="17261F"/>
+                <w:sz w:val="16"/>
+                <w:szCs w:val="16"/>
+              </w:rPr>
+              <w:t xml:space="preserve">  crops --&gt; prov --&gt; broker</w:t>
+            </w:r>
+          </w:p>
+          <w:p>
+            <w:pPr>
+              <w:spacing w:before="0" w:after="0" w:line="252" w:lineRule="auto"/>
+            </w:pPr>
+            <w:r>
+              <w:rPr>
+                <w:rFonts w:ascii="JetBrains Mono" w:hAnsi="JetBrains Mono" w:eastAsia="JetBrains Mono" w:cs="JetBrains Mono"/>
+                <w:color w:val="17261F"/>
+                <w:sz w:val="16"/>
+                <w:szCs w:val="16"/>
+              </w:rPr>
+              <w:t xml:space="preserve">  gateway &lt;--&gt;|"telemetría · comandos · ACK · estado"| broker</w:t>
+            </w:r>
+          </w:p>
+          <w:p>
+            <w:pPr>
+              <w:spacing w:before="0" w:after="0" w:line="252" w:lineRule="auto"/>
+            </w:pPr>
+            <w:r>
+              <w:rPr>
+                <w:rFonts w:ascii="JetBrains Mono" w:hAnsi="JetBrains Mono" w:eastAsia="JetBrains Mono" w:cs="JetBrains Mono"/>
+                <w:color w:val="17261F"/>
+                <w:sz w:val="16"/>
+                <w:szCs w:val="16"/>
+              </w:rPr>
+              <w:t xml:space="preserve">  gateway --&gt; readings &amp; actuators &amp; crops</w:t>
+            </w:r>
+          </w:p>
+          <w:p>
+            <w:pPr>
+              <w:spacing w:before="0" w:after="0" w:line="252" w:lineRule="auto"/>
+            </w:pPr>
+            <w:r>
+              <w:rPr>
+                <w:rFonts w:ascii="JetBrains Mono" w:hAnsi="JetBrains Mono" w:eastAsia="JetBrains Mono" w:cs="JetBrains Mono"/>
+                <w:color w:val="17261F"/>
+                <w:sz w:val="16"/>
+                <w:szCs w:val="16"/>
+              </w:rPr>
+              <w:t xml:space="preserve">  readings -.-&gt;|"ReadingRecordedEvent"| ai</w:t>
+            </w:r>
+          </w:p>
+          <w:p>
+            <w:pPr>
+              <w:spacing w:before="0" w:after="0" w:line="252" w:lineRule="auto"/>
+            </w:pPr>
+            <w:r>
+              <w:rPr>
+                <w:rFonts w:ascii="JetBrains Mono" w:hAnsi="JetBrains Mono" w:eastAsia="JetBrains Mono" w:cs="JetBrains Mono"/>
+                <w:color w:val="17261F"/>
+                <w:sz w:val="16"/>
+                <w:szCs w:val="16"/>
+              </w:rPr>
+              <w:t xml:space="preserve">  ai --&gt;|"POST /v1/insights · /v1/learning"| aisvc</w:t>
+            </w:r>
+          </w:p>
+          <w:p>
+            <w:pPr>
+              <w:spacing w:before="0" w:after="0" w:line="252" w:lineRule="auto"/>
+            </w:pPr>
+            <w:r>
+              <w:rPr>
+                <w:rFonts w:ascii="JetBrains Mono" w:hAnsi="JetBrains Mono" w:eastAsia="JetBrains Mono" w:cs="JetBrains Mono"/>
+                <w:color w:val="17261F"/>
+                <w:sz w:val="16"/>
+                <w:szCs w:val="16"/>
+              </w:rPr>
+              <w:t xml:space="preserve">  ai --&gt; actuators --&gt; gateway</w:t>
+            </w:r>
+          </w:p>
+          <w:p>
+            <w:pPr>
+              <w:spacing w:before="0" w:after="0" w:line="252" w:lineRule="auto"/>
+            </w:pPr>
+            <w:r>
+              <w:rPr>
+                <w:rFonts w:ascii="JetBrains Mono" w:hAnsi="JetBrains Mono" w:eastAsia="JetBrains Mono" w:cs="JetBrains Mono"/>
+                <w:color w:val="17261F"/>
+                <w:sz w:val="16"/>
+                <w:szCs w:val="16"/>
+              </w:rPr>
+              <w:t xml:space="preserve">  virtual --&gt;|"PUT /v1/pots · token"| sim</w:t>
+            </w:r>
+          </w:p>
+          <w:p>
+            <w:pPr>
+              <w:spacing w:before="0" w:after="0" w:line="252" w:lineRule="auto"/>
+            </w:pPr>
+            <w:r>
+              <w:rPr>
+                <w:rFonts w:ascii="JetBrains Mono" w:hAnsi="JetBrains Mono" w:eastAsia="JetBrains Mono" w:cs="JetBrains Mono"/>
+                <w:color w:val="17261F"/>
+                <w:sz w:val="16"/>
+                <w:szCs w:val="16"/>
+              </w:rPr>
+              <w:t xml:space="preserve">  crops --&gt;|"GET /v1/weather · token"| sim</w:t>
+            </w:r>
+          </w:p>
+          <w:p>
+            <w:pPr>
+              <w:spacing w:before="0" w:after="0" w:line="252" w:lineRule="auto"/>
+            </w:pPr>
+            <w:r>
+              <w:rPr>
+                <w:rFonts w:ascii="JetBrains Mono" w:hAnsi="JetBrains Mono" w:eastAsia="JetBrains Mono" w:cs="JetBrains Mono"/>
+                <w:color w:val="17261F"/>
+                <w:sz w:val="16"/>
+                <w:szCs w:val="16"/>
+              </w:rPr>
+              <w:t xml:space="preserve">  sim --&gt;|"MQTT con la cuenta del cultivo"| broker</w:t>
+            </w:r>
+          </w:p>
+          <w:p>
+            <w:pPr>
+              <w:spacing w:before="0" w:after="0" w:line="252" w:lineRule="auto"/>
+            </w:pPr>
+            <w:r>
+              <w:rPr>
+                <w:rFonts w:ascii="JetBrains Mono" w:hAnsi="JetBrains Mono" w:eastAsia="JetBrains Mono" w:cs="JetBrains Mono"/>
+                <w:color w:val="17261F"/>
+                <w:sz w:val="16"/>
+                <w:szCs w:val="16"/>
+              </w:rPr>
+              <w:t xml:space="preserve">  classDef leaf fill:#DDF5EA,stroke:#067A52,color:#17261F</w:t>
+            </w:r>
+          </w:p>
+          <w:p>
+            <w:pPr>
+              <w:spacing w:before="0" w:after="0" w:line="252" w:lineRule="auto"/>
+            </w:pPr>
+            <w:r>
+              <w:rPr>
+                <w:rFonts w:ascii="JetBrains Mono" w:hAnsi="JetBrains Mono" w:eastAsia="JetBrains Mono" w:cs="JetBrains Mono"/>
+                <w:color w:val="17261F"/>
+                <w:sz w:val="16"/>
+                <w:szCs w:val="16"/>
+              </w:rPr>
+              <w:t xml:space="preserve">  classDef water fill:#E3F2FB,stroke:#1F6FA0,color:#17261F</w:t>
+            </w:r>
+          </w:p>
+          <w:p>
+            <w:pPr>
+              <w:spacing w:before="0" w:after="0" w:line="252" w:lineRule="auto"/>
+            </w:pPr>
+            <w:r>
+              <w:rPr>
+                <w:rFonts w:ascii="JetBrains Mono" w:hAnsi="JetBrains Mono" w:eastAsia="JetBrains Mono" w:cs="JetBrains Mono"/>
+                <w:color w:val="17261F"/>
+                <w:sz w:val="16"/>
+                <w:szCs w:val="16"/>
+              </w:rPr>
+              <w:t xml:space="preserve">  classDef sun fill:#FDF4DD,stroke:#C98D12,color:#17261F</w:t>
+            </w:r>
+          </w:p>
+          <w:p>
+            <w:pPr>
+              <w:spacing w:before="0" w:after="0" w:line="252" w:lineRule="auto"/>
+            </w:pPr>
+            <w:r>
+              <w:rPr>
+                <w:rFonts w:ascii="JetBrains Mono" w:hAnsi="JetBrains Mono" w:eastAsia="JetBrains Mono" w:cs="JetBrains Mono"/>
+                <w:color w:val="17261F"/>
+                <w:sz w:val="16"/>
+                <w:szCs w:val="16"/>
+              </w:rPr>
+              <w:t xml:space="preserve">  classDef clay fill:#FBE9E1,stroke:#B85A38,color:#17261F</w:t>
+            </w:r>
+          </w:p>
+          <w:p>
+            <w:pPr>
+              <w:spacing w:before="0" w:after="0" w:line="252" w:lineRule="auto"/>
+            </w:pPr>
+            <w:r>
+              <w:rPr>
+                <w:rFonts w:ascii="JetBrains Mono" w:hAnsi="JetBrains Mono" w:eastAsia="JetBrains Mono" w:cs="JetBrains Mono"/>
+                <w:color w:val="17261F"/>
+                <w:sz w:val="16"/>
+                <w:szCs w:val="16"/>
+              </w:rPr>
+              <w:t xml:space="preserve">  classDef core fill:#067A52,stroke:#0B3D2B,color:#FFFFFF</w:t>
+            </w:r>
+          </w:p>
+          <w:p>
+            <w:pPr>
+              <w:spacing w:before="0" w:after="0" w:line="252" w:lineRule="auto"/>
+            </w:pPr>
+            <w:r>
+              <w:rPr>
+                <w:rFonts w:ascii="JetBrains Mono" w:hAnsi="JetBrains Mono" w:eastAsia="JetBrains Mono" w:cs="JetBrains Mono"/>
+                <w:color w:val="17261F"/>
+                <w:sz w:val="16"/>
+                <w:szCs w:val="16"/>
+              </w:rPr>
+              <w:t xml:space="preserve">  classDef deep fill:#0B3D2B,stroke:#06281C,color:#FFFFFF</w:t>
+            </w:r>
+          </w:p>
+          <w:p>
+            <w:pPr>
+              <w:spacing w:before="0" w:after="0" w:line="252" w:lineRule="auto"/>
+            </w:pPr>
+            <w:r>
+              <w:rPr>
+                <w:rFonts w:ascii="JetBrains Mono" w:hAnsi="JetBrains Mono" w:eastAsia="JetBrains Mono" w:cs="JetBrains Mono"/>
+                <w:color w:val="17261F"/>
+                <w:sz w:val="16"/>
+                <w:szCs w:val="16"/>
+              </w:rPr>
+              <w:t xml:space="preserve">  classDef muted fill:#F2F7F4,stroke:#5B6B63,color:#17261F</w:t>
+            </w:r>
+          </w:p>
+          <w:p>
+            <w:pPr>
+              <w:spacing w:before="0" w:after="0" w:line="252" w:lineRule="auto"/>
+            </w:pPr>
+            <w:r>
+              <w:rPr>
+                <w:rFonts w:ascii="JetBrains Mono" w:hAnsi="JetBrains Mono" w:eastAsia="JetBrains Mono" w:cs="JetBrains Mono"/>
+                <w:color w:val="17261F"/>
+                <w:sz w:val="16"/>
+                <w:szCs w:val="16"/>
+              </w:rPr>
+              <w:t xml:space="preserve">  class pwa,tg,broker,aisvc,sim,smtp water</w:t>
+            </w:r>
+          </w:p>
+          <w:p>
+            <w:pPr>
+              <w:spacing w:before="0" w:after="0" w:line="252" w:lineRule="auto"/>
+            </w:pPr>
+            <w:r>
+              <w:rPr>
+                <w:rFonts w:ascii="JetBrains Mono" w:hAnsi="JetBrains Mono" w:eastAsia="JetBrains Mono" w:cs="JetBrains Mono"/>
+                <w:color w:val="17261F"/>
+                <w:sz w:val="16"/>
+                <w:szCs w:val="16"/>
+              </w:rPr>
+              <w:t xml:space="preserve">  class sec,rate sun</w:t>
+            </w:r>
+          </w:p>
+          <w:p>
+            <w:pPr>
+              <w:spacing w:before="0" w:after="0" w:line="252" w:lineRule="auto"/>
+            </w:pPr>
+            <w:r>
+              <w:rPr>
+                <w:rFonts w:ascii="JetBrains Mono" w:hAnsi="JetBrains Mono" w:eastAsia="JetBrains Mono" w:cs="JetBrains Mono"/>
+                <w:color w:val="17261F"/>
+                <w:sz w:val="16"/>
+                <w:szCs w:val="16"/>
+              </w:rPr>
+              <w:t xml:space="preserve">  class auth,crops,readings,actuators,overview,notif,virtual,ai leaf</w:t>
+            </w:r>
+          </w:p>
+          <w:p>
+            <w:pPr>
+              <w:spacing w:before="0" w:after="0" w:line="252" w:lineRule="auto"/>
+            </w:pPr>
+            <w:r>
+              <w:rPr>
+                <w:rFonts w:ascii="JetBrains Mono" w:hAnsi="JetBrains Mono" w:eastAsia="JetBrains Mono" w:cs="JetBrains Mono"/>
+                <w:color w:val="17261F"/>
+                <w:sz w:val="16"/>
+                <w:szCs w:val="16"/>
+              </w:rPr>
+              <w:t xml:space="preserve">  class gateway,prov core</w:t>
+            </w:r>
+          </w:p>
+          <w:p>
+            <w:pPr>
+              <w:spacing w:before="0" w:after="0" w:line="252" w:lineRule="auto"/>
+            </w:pPr>
+            <w:r>
+              <w:rPr>
+                <w:rFonts w:ascii="JetBrains Mono" w:hAnsi="JetBrains Mono" w:eastAsia="JetBrains Mono" w:cs="JetBrains Mono"/>
+                <w:color w:val="17261F"/>
+                <w:sz w:val="16"/>
+                <w:szCs w:val="16"/>
+              </w:rPr>
+              <w:t xml:space="preserve">  class mongo,redis muted</w:t>
+            </w:r>
+          </w:p>
+        </w:tc>
+      </w:tr>
+    </w:tbl>
+    <w:p>
+      <w:pPr>
+        <w:spacing w:before="160" w:after="0" w:line="240" w:lineRule="auto"/>
+        <w:rPr>
+          <w:sz w:val="8"/>
+        </w:rPr>
       </w:pPr>
     </w:p>
     <w:p>
@@ -3524,7 +4450,7 @@
                 <w:sz w:val="17"/>
                 <w:szCs w:val="17"/>
               </w:rPr>
-              <w:t xml:space="preserve">Bomba, luz de cultivo y ventilador</w:t>
+              <w:t xml:space="preserve">Bomba, luz ultravioleta y ventilador</w:t>
             </w:r>
           </w:p>
         </w:tc>
@@ -3914,6 +4840,568 @@
         </w:rPr>
         <w:t xml:space="preserve">  ·  Crear un cultivo real o virtual</w:t>
       </w:r>
+    </w:p>
+    <w:p>
+      <w:pPr>
+        <w:spacing w:before="80" w:after="0" w:line="240" w:lineRule="auto"/>
+        <w:rPr>
+          <w:sz w:val="8"/>
+        </w:rPr>
+      </w:pPr>
+    </w:p>
+    <w:tbl>
+      <w:tblPr>
+        <w:tblW w:w="9360" w:type="dxa"/>
+        <w:tblInd w:w="0" w:type="dxa"/>
+        <w:tblBorders>
+          <w:top w:val="nil"/>
+          <w:left w:val="nil"/>
+          <w:bottom w:val="nil"/>
+          <w:right w:val="nil"/>
+          <w:insideH w:val="nil"/>
+          <w:insideV w:val="nil"/>
+        </w:tblBorders>
+        <w:tblLayout w:type="fixed"/>
+        <w:tblCellMar>
+          <w:left w:w="0" w:type="dxa"/>
+          <w:right w:w="0" w:type="dxa"/>
+        </w:tblCellMar>
+        <w:tblLook w:val="0000" w:firstRow="0" w:lastRow="0" w:firstColumn="0" w:lastColumn="0" w:noHBand="1" w:noVBand="1"/>
+      </w:tblPr>
+      <w:tblGrid>
+        <w:gridCol w:w="9360"/>
+      </w:tblGrid>
+      <w:tr>
+        <w:trPr>
+          <w:cantSplit/>
+        </w:trPr>
+        <w:tc>
+          <w:tcPr>
+            <w:tcW w:w="9360" w:type="dxa"/>
+            <w:shd w:val="clear" w:color="auto" w:fill="0B3D2B"/>
+            <w:tcMar>
+              <w:top w:w="60" w:type="dxa"/>
+              <w:left w:w="200" w:type="dxa"/>
+              <w:bottom w:w="60" w:type="dxa"/>
+              <w:right w:w="200" w:type="dxa"/>
+            </w:tcMar>
+            <w:vAlign w:val="top"/>
+          </w:tcPr>
+          <w:p>
+            <w:pPr>
+              <w:spacing w:before="0" w:after="0" w:line="240" w:lineRule="auto"/>
+            </w:pPr>
+            <w:r>
+              <w:rPr>
+                <w:b/>
+                <w:bCs/>
+                <w:color w:val="7FDBB0"/>
+                <w:spacing w:val="40"/>
+                <w:sz w:val="14"/>
+                <w:szCs w:val="14"/>
+              </w:rPr>
+              <w:t xml:space="preserve">MERMAID</w:t>
+            </w:r>
+          </w:p>
+        </w:tc>
+      </w:tr>
+    </w:tbl>
+    <w:tbl>
+      <w:tblPr>
+        <w:tblW w:w="9360" w:type="dxa"/>
+        <w:tblInd w:w="0" w:type="dxa"/>
+        <w:tblBorders>
+          <w:top w:val="nil"/>
+          <w:left w:val="nil"/>
+          <w:bottom w:val="nil"/>
+          <w:right w:val="nil"/>
+          <w:insideH w:val="nil"/>
+          <w:insideV w:val="nil"/>
+        </w:tblBorders>
+        <w:tblLayout w:type="fixed"/>
+        <w:tblCellMar>
+          <w:left w:w="0" w:type="dxa"/>
+          <w:right w:w="0" w:type="dxa"/>
+        </w:tblCellMar>
+        <w:tblLook w:val="0000" w:firstRow="0" w:lastRow="0" w:firstColumn="0" w:lastColumn="0" w:noHBand="1" w:noVBand="1"/>
+      </w:tblPr>
+      <w:tblGrid>
+        <w:gridCol w:w="9360"/>
+      </w:tblGrid>
+      <w:tr>
+        <w:trPr>
+          <w:cantSplit/>
+        </w:trPr>
+        <w:tc>
+          <w:tcPr>
+            <w:tcW w:w="9360" w:type="dxa"/>
+            <w:shd w:val="clear" w:color="auto" w:fill="F7FAF8"/>
+            <w:tcMar>
+              <w:top w:w="120" w:type="dxa"/>
+              <w:left w:w="200" w:type="dxa"/>
+              <w:bottom w:w="120" w:type="dxa"/>
+              <w:right w:w="200" w:type="dxa"/>
+            </w:tcMar>
+            <w:vAlign w:val="top"/>
+          </w:tcPr>
+          <w:p>
+            <w:pPr>
+              <w:spacing w:before="0" w:after="0" w:line="252" w:lineRule="auto"/>
+            </w:pPr>
+            <w:r>
+              <w:rPr>
+                <w:rFonts w:ascii="JetBrains Mono" w:hAnsi="JetBrains Mono" w:eastAsia="JetBrains Mono" w:cs="JetBrains Mono"/>
+                <w:color w:val="17261F"/>
+                <w:sz w:val="16"/>
+                <w:szCs w:val="16"/>
+              </w:rPr>
+              <w:t xml:space="preserve">%%{init: {"theme": "base", "fontFamily": "Segoe UI, Arial, sans-serif", "themeVariables": {"fontFamily": "Segoe UI, Arial, sans-serif", "fontSize": "15px", "primaryColor": "#DDF5EA", "primaryTextColor": "#17261F", "primaryBorderColor": "#067A52", "secondaryColor": "#E3F2FB", "secondaryTextColor": "#17261F", "secondaryBorderColor": "#1F6FA0", "tertiaryColor": "#F2F7F4", "tertiaryTextColor": "#17261F", "tertiaryBorderColor": "#D5E3DC", "lineColor": "#5B6B63", "textColor": "#17261F", "mainBkg": "#DDF5EA", "nodeBorder": "#067A52", "clusterBkg": "#F7FAF8", "clusterBorder": "#D5E3DC", "edgeLabelBackground": "#FFFFFF", "actorBkg": "#067A52", "actorBorder": "#0B3D2B", "actorTextColor": "#FFFFFF", "actorLineColor": "#5B6B63", "signalColor": "#17261F", "signalTextColor": "#17261F", "labelBoxBkgColor": "#0B3D2B", "labelBoxBorderColor": "#0B3D2B", "labelTextColor": "#FFFFFF", "loopTextColor": "#0B3D2B", "noteBkgColor": "#FDF4DD", "noteBorderColor": "#C98D12", "noteTextColor": "#17261F", "activationBkgColor": "#DDF5EA", "activationBorderColor": "#067A52", "attributeBackgroundColorOdd": "#FFFFFF", "attributeBackgroundColorEven": "#F2F7F4"}}}%%</w:t>
+            </w:r>
+          </w:p>
+          <w:p>
+            <w:pPr>
+              <w:spacing w:before="0" w:after="0" w:line="252" w:lineRule="auto"/>
+            </w:pPr>
+            <w:r>
+              <w:rPr>
+                <w:rFonts w:ascii="JetBrains Mono" w:hAnsi="JetBrains Mono" w:eastAsia="JetBrains Mono" w:cs="JetBrains Mono"/>
+                <w:color w:val="17261F"/>
+                <w:sz w:val="16"/>
+                <w:szCs w:val="16"/>
+              </w:rPr>
+              <w:t xml:space="preserve">sequenceDiagram</w:t>
+            </w:r>
+          </w:p>
+          <w:p>
+            <w:pPr>
+              <w:spacing w:before="0" w:after="0" w:line="252" w:lineRule="auto"/>
+            </w:pPr>
+            <w:r>
+              <w:rPr>
+                <w:rFonts w:ascii="JetBrains Mono" w:hAnsi="JetBrains Mono" w:eastAsia="JetBrains Mono" w:cs="JetBrains Mono"/>
+                <w:color w:val="17261F"/>
+                <w:sz w:val="16"/>
+                <w:szCs w:val="16"/>
+              </w:rPr>
+              <w:t xml:space="preserve">  autonumber</w:t>
+            </w:r>
+          </w:p>
+          <w:p>
+            <w:pPr>
+              <w:spacing w:before="0" w:after="0" w:line="252" w:lineRule="auto"/>
+            </w:pPr>
+            <w:r>
+              <w:rPr>
+                <w:rFonts w:ascii="JetBrains Mono" w:hAnsi="JetBrains Mono" w:eastAsia="JetBrains Mono" w:cs="JetBrains Mono"/>
+                <w:color w:val="17261F"/>
+                <w:sz w:val="16"/>
+                <w:szCs w:val="16"/>
+              </w:rPr>
+              <w:t xml:space="preserve">  participant W as PWA</w:t>
+            </w:r>
+          </w:p>
+          <w:p>
+            <w:pPr>
+              <w:spacing w:before="0" w:after="0" w:line="252" w:lineRule="auto"/>
+            </w:pPr>
+            <w:r>
+              <w:rPr>
+                <w:rFonts w:ascii="JetBrains Mono" w:hAnsi="JetBrains Mono" w:eastAsia="JetBrains Mono" w:cs="JetBrains Mono"/>
+                <w:color w:val="17261F"/>
+                <w:sz w:val="16"/>
+                <w:szCs w:val="16"/>
+              </w:rPr>
+              <w:t xml:space="preserve">  participant C as CropController</w:t>
+            </w:r>
+          </w:p>
+          <w:p>
+            <w:pPr>
+              <w:spacing w:before="0" w:after="0" w:line="252" w:lineRule="auto"/>
+            </w:pPr>
+            <w:r>
+              <w:rPr>
+                <w:rFonts w:ascii="JetBrains Mono" w:hAnsi="JetBrains Mono" w:eastAsia="JetBrains Mono" w:cs="JetBrains Mono"/>
+                <w:color w:val="17261F"/>
+                <w:sz w:val="16"/>
+                <w:szCs w:val="16"/>
+              </w:rPr>
+              <w:t xml:space="preserve">  participant V as VirtualDeviceService</w:t>
+            </w:r>
+          </w:p>
+          <w:p>
+            <w:pPr>
+              <w:spacing w:before="0" w:after="0" w:line="252" w:lineRule="auto"/>
+            </w:pPr>
+            <w:r>
+              <w:rPr>
+                <w:rFonts w:ascii="JetBrains Mono" w:hAnsi="JetBrains Mono" w:eastAsia="JetBrains Mono" w:cs="JetBrains Mono"/>
+                <w:color w:val="17261F"/>
+                <w:sz w:val="16"/>
+                <w:szCs w:val="16"/>
+              </w:rPr>
+              <w:t xml:space="preserve">  participant S as CropService</w:t>
+            </w:r>
+          </w:p>
+          <w:p>
+            <w:pPr>
+              <w:spacing w:before="0" w:after="0" w:line="252" w:lineRule="auto"/>
+            </w:pPr>
+            <w:r>
+              <w:rPr>
+                <w:rFonts w:ascii="JetBrains Mono" w:hAnsi="JetBrains Mono" w:eastAsia="JetBrains Mono" w:cs="JetBrains Mono"/>
+                <w:color w:val="17261F"/>
+                <w:sz w:val="16"/>
+                <w:szCs w:val="16"/>
+              </w:rPr>
+              <w:t xml:space="preserve">  participant P as DeviceProvisioner</w:t>
+            </w:r>
+          </w:p>
+          <w:p>
+            <w:pPr>
+              <w:spacing w:before="0" w:after="0" w:line="252" w:lineRule="auto"/>
+            </w:pPr>
+            <w:r>
+              <w:rPr>
+                <w:rFonts w:ascii="JetBrains Mono" w:hAnsi="JetBrains Mono" w:eastAsia="JetBrains Mono" w:cs="JetBrains Mono"/>
+                <w:color w:val="17261F"/>
+                <w:sz w:val="16"/>
+                <w:szCs w:val="16"/>
+              </w:rPr>
+              <w:t xml:space="preserve">  participant D as MongoDB</w:t>
+            </w:r>
+          </w:p>
+          <w:p>
+            <w:pPr>
+              <w:spacing w:before="0" w:after="0" w:line="252" w:lineRule="auto"/>
+            </w:pPr>
+            <w:r>
+              <w:rPr>
+                <w:rFonts w:ascii="JetBrains Mono" w:hAnsi="JetBrains Mono" w:eastAsia="JetBrains Mono" w:cs="JetBrains Mono"/>
+                <w:color w:val="17261F"/>
+                <w:sz w:val="16"/>
+                <w:szCs w:val="16"/>
+              </w:rPr>
+              <w:t xml:space="preserve">  participant SIM as Simulador</w:t>
+            </w:r>
+          </w:p>
+          <w:p>
+            <w:pPr>
+              <w:spacing w:before="0" w:after="0" w:line="252" w:lineRule="auto"/>
+            </w:pPr>
+            <w:r>
+              <w:rPr>
+                <w:rFonts w:ascii="JetBrains Mono" w:hAnsi="JetBrains Mono" w:eastAsia="JetBrains Mono" w:cs="JetBrains Mono"/>
+                <w:color w:val="17261F"/>
+                <w:sz w:val="16"/>
+                <w:szCs w:val="16"/>
+              </w:rPr>
+              <w:t xml:space="preserve">  W-&gt;&gt;C: POST /api/v1/crops {name, type, kind, form, virtual?}</w:t>
+            </w:r>
+          </w:p>
+          <w:p>
+            <w:pPr>
+              <w:spacing w:before="0" w:after="0" w:line="252" w:lineRule="auto"/>
+            </w:pPr>
+            <w:r>
+              <w:rPr>
+                <w:rFonts w:ascii="JetBrains Mono" w:hAnsi="JetBrains Mono" w:eastAsia="JetBrains Mono" w:cs="JetBrains Mono"/>
+                <w:color w:val="17261F"/>
+                <w:sz w:val="16"/>
+                <w:szCs w:val="16"/>
+              </w:rPr>
+              <w:t xml:space="preserve">  alt kind VIRTUAL</w:t>
+            </w:r>
+          </w:p>
+          <w:p>
+            <w:pPr>
+              <w:spacing w:before="0" w:after="0" w:line="252" w:lineRule="auto"/>
+            </w:pPr>
+            <w:r>
+              <w:rPr>
+                <w:rFonts w:ascii="JetBrains Mono" w:hAnsi="JetBrains Mono" w:eastAsia="JetBrains Mono" w:cs="JetBrains Mono"/>
+                <w:color w:val="17261F"/>
+                <w:sz w:val="16"/>
+                <w:szCs w:val="16"/>
+              </w:rPr>
+              <w:t xml:space="preserve">    C-&gt;&gt;V: checkCanCreate (simulador disponible, máximo 5, lugar si es clima)</w:t>
+            </w:r>
+          </w:p>
+          <w:p>
+            <w:pPr>
+              <w:spacing w:before="0" w:after="0" w:line="252" w:lineRule="auto"/>
+            </w:pPr>
+            <w:r>
+              <w:rPr>
+                <w:rFonts w:ascii="JetBrains Mono" w:hAnsi="JetBrains Mono" w:eastAsia="JetBrains Mono" w:cs="JetBrains Mono"/>
+                <w:color w:val="17261F"/>
+                <w:sz w:val="16"/>
+                <w:szCs w:val="16"/>
+              </w:rPr>
+              <w:t xml:space="preserve">  else kind REAL con virtual</w:t>
+            </w:r>
+          </w:p>
+          <w:p>
+            <w:pPr>
+              <w:spacing w:before="0" w:after="0" w:line="252" w:lineRule="auto"/>
+            </w:pPr>
+            <w:r>
+              <w:rPr>
+                <w:rFonts w:ascii="JetBrains Mono" w:hAnsi="JetBrains Mono" w:eastAsia="JetBrains Mono" w:cs="JetBrains Mono"/>
+                <w:color w:val="17261F"/>
+                <w:sz w:val="16"/>
+                <w:szCs w:val="16"/>
+              </w:rPr>
+              <w:t xml:space="preserve">    C--&gt;&gt;W: 400 Solo los cultivos virtuales tienen simulación</w:t>
+            </w:r>
+          </w:p>
+          <w:p>
+            <w:pPr>
+              <w:spacing w:before="0" w:after="0" w:line="252" w:lineRule="auto"/>
+            </w:pPr>
+            <w:r>
+              <w:rPr>
+                <w:rFonts w:ascii="JetBrains Mono" w:hAnsi="JetBrains Mono" w:eastAsia="JetBrains Mono" w:cs="JetBrains Mono"/>
+                <w:color w:val="17261F"/>
+                <w:sz w:val="16"/>
+                <w:szCs w:val="16"/>
+              </w:rPr>
+              <w:t xml:space="preserve">  end</w:t>
+            </w:r>
+          </w:p>
+          <w:p>
+            <w:pPr>
+              <w:spacing w:before="0" w:after="0" w:line="252" w:lineRule="auto"/>
+            </w:pPr>
+            <w:r>
+              <w:rPr>
+                <w:rFonts w:ascii="JetBrains Mono" w:hAnsi="JetBrains Mono" w:eastAsia="JetBrains Mono" w:cs="JetBrains Mono"/>
+                <w:color w:val="17261F"/>
+                <w:sz w:val="16"/>
+                <w:szCs w:val="16"/>
+              </w:rPr>
+              <w:t xml:space="preserve">  C-&gt;&gt;S: create(owner, request)</w:t>
+            </w:r>
+          </w:p>
+          <w:p>
+            <w:pPr>
+              <w:spacing w:before="0" w:after="0" w:line="252" w:lineRule="auto"/>
+            </w:pPr>
+            <w:r>
+              <w:rPr>
+                <w:rFonts w:ascii="JetBrains Mono" w:hAnsi="JetBrains Mono" w:eastAsia="JetBrains Mono" w:cs="JetBrains Mono"/>
+                <w:color w:val="17261F"/>
+                <w:sz w:val="16"/>
+                <w:szCs w:val="16"/>
+              </w:rPr>
+              <w:t xml:space="preserve">  S-&gt;&gt;D: cuenta los cultivos (máximo 20)</w:t>
+            </w:r>
+          </w:p>
+          <w:p>
+            <w:pPr>
+              <w:spacing w:before="0" w:after="0" w:line="252" w:lineRule="auto"/>
+            </w:pPr>
+            <w:r>
+              <w:rPr>
+                <w:rFonts w:ascii="JetBrains Mono" w:hAnsi="JetBrains Mono" w:eastAsia="JetBrains Mono" w:cs="JetBrains Mono"/>
+                <w:color w:val="17261F"/>
+                <w:sz w:val="16"/>
+                <w:szCs w:val="16"/>
+              </w:rPr>
+              <w:t xml:space="preserve">  S-&gt;&gt;S: clave de 24 bytes · AES-256-GCM</w:t>
+            </w:r>
+          </w:p>
+          <w:p>
+            <w:pPr>
+              <w:spacing w:before="0" w:after="0" w:line="252" w:lineRule="auto"/>
+            </w:pPr>
+            <w:r>
+              <w:rPr>
+                <w:rFonts w:ascii="JetBrains Mono" w:hAnsi="JetBrains Mono" w:eastAsia="JetBrains Mono" w:cs="JetBrains Mono"/>
+                <w:color w:val="17261F"/>
+                <w:sz w:val="16"/>
+                <w:szCs w:val="16"/>
+              </w:rPr>
+              <w:t xml:space="preserve">  S-&gt;&gt;D: crops (kind, form POT si falta)</w:t>
+            </w:r>
+          </w:p>
+          <w:p>
+            <w:pPr>
+              <w:spacing w:before="0" w:after="0" w:line="252" w:lineRule="auto"/>
+            </w:pPr>
+            <w:r>
+              <w:rPr>
+                <w:rFonts w:ascii="JetBrains Mono" w:hAnsi="JetBrains Mono" w:eastAsia="JetBrains Mono" w:cs="JetBrains Mono"/>
+                <w:color w:val="17261F"/>
+                <w:sz w:val="16"/>
+                <w:szCs w:val="16"/>
+              </w:rPr>
+              <w:t xml:space="preserve">  S-&gt;&gt;D: actuators · reales: bomba, luz y ventilador · virtuales: los seis</w:t>
+            </w:r>
+          </w:p>
+          <w:p>
+            <w:pPr>
+              <w:spacing w:before="0" w:after="0" w:line="252" w:lineRule="auto"/>
+            </w:pPr>
+            <w:r>
+              <w:rPr>
+                <w:rFonts w:ascii="JetBrains Mono" w:hAnsi="JetBrains Mono" w:eastAsia="JetBrains Mono" w:cs="JetBrains Mono"/>
+                <w:color w:val="17261F"/>
+                <w:sz w:val="16"/>
+                <w:szCs w:val="16"/>
+              </w:rPr>
+              <w:t xml:space="preserve">  S-&gt;&gt;P: provision(cropId, clave)</w:t>
+            </w:r>
+          </w:p>
+          <w:p>
+            <w:pPr>
+              <w:spacing w:before="0" w:after="0" w:line="252" w:lineRule="auto"/>
+            </w:pPr>
+            <w:r>
+              <w:rPr>
+                <w:rFonts w:ascii="JetBrains Mono" w:hAnsi="JetBrains Mono" w:eastAsia="JetBrains Mono" w:cs="JetBrains Mono"/>
+                <w:color w:val="17261F"/>
+                <w:sz w:val="16"/>
+                <w:szCs w:val="16"/>
+              </w:rPr>
+              <w:t xml:space="preserve">  S-)S: DeviceKeyRotatedEvent</w:t>
+            </w:r>
+          </w:p>
+          <w:p>
+            <w:pPr>
+              <w:spacing w:before="0" w:after="0" w:line="252" w:lineRule="auto"/>
+            </w:pPr>
+            <w:r>
+              <w:rPr>
+                <w:rFonts w:ascii="JetBrains Mono" w:hAnsi="JetBrains Mono" w:eastAsia="JetBrains Mono" w:cs="JetBrains Mono"/>
+                <w:color w:val="17261F"/>
+                <w:sz w:val="16"/>
+                <w:szCs w:val="16"/>
+              </w:rPr>
+              <w:t xml:space="preserve">  alt Virtual</w:t>
+            </w:r>
+          </w:p>
+          <w:p>
+            <w:pPr>
+              <w:spacing w:before="0" w:after="0" w:line="252" w:lineRule="auto"/>
+            </w:pPr>
+            <w:r>
+              <w:rPr>
+                <w:rFonts w:ascii="JetBrains Mono" w:hAnsi="JetBrains Mono" w:eastAsia="JetBrains Mono" w:cs="JetBrains Mono"/>
+                <w:color w:val="17261F"/>
+                <w:sz w:val="16"/>
+                <w:szCs w:val="16"/>
+              </w:rPr>
+              <w:t xml:space="preserve">    C-&gt;&gt;V: startFor(crop, virtual o AUTO)</w:t>
+            </w:r>
+          </w:p>
+          <w:p>
+            <w:pPr>
+              <w:spacing w:before="0" w:after="0" w:line="252" w:lineRule="auto"/>
+            </w:pPr>
+            <w:r>
+              <w:rPr>
+                <w:rFonts w:ascii="JetBrains Mono" w:hAnsi="JetBrains Mono" w:eastAsia="JetBrains Mono" w:cs="JetBrains Mono"/>
+                <w:color w:val="17261F"/>
+                <w:sz w:val="16"/>
+                <w:szCs w:val="16"/>
+              </w:rPr>
+              <w:t xml:space="preserve">    V-&gt;&gt;D: virtual_devices activo</w:t>
+            </w:r>
+          </w:p>
+          <w:p>
+            <w:pPr>
+              <w:spacing w:before="0" w:after="0" w:line="252" w:lineRule="auto"/>
+            </w:pPr>
+            <w:r>
+              <w:rPr>
+                <w:rFonts w:ascii="JetBrains Mono" w:hAnsi="JetBrains Mono" w:eastAsia="JetBrains Mono" w:cs="JetBrains Mono"/>
+                <w:color w:val="17261F"/>
+                <w:sz w:val="16"/>
+                <w:szCs w:val="16"/>
+              </w:rPr>
+              <w:t xml:space="preserve">    V-&gt;&gt;SIM: PUT /v1/pots/{cropId} con la clave</w:t>
+            </w:r>
+          </w:p>
+          <w:p>
+            <w:pPr>
+              <w:spacing w:before="0" w:after="0" w:line="252" w:lineRule="auto"/>
+            </w:pPr>
+            <w:r>
+              <w:rPr>
+                <w:rFonts w:ascii="JetBrains Mono" w:hAnsi="JetBrains Mono" w:eastAsia="JetBrains Mono" w:cs="JetBrains Mono"/>
+                <w:color w:val="17261F"/>
+                <w:sz w:val="16"/>
+                <w:szCs w:val="16"/>
+              </w:rPr>
+              <w:t xml:space="preserve">    C--&gt;&gt;W: 201 cultivo sin credenciales</w:t>
+            </w:r>
+          </w:p>
+          <w:p>
+            <w:pPr>
+              <w:spacing w:before="0" w:after="0" w:line="252" w:lineRule="auto"/>
+            </w:pPr>
+            <w:r>
+              <w:rPr>
+                <w:rFonts w:ascii="JetBrains Mono" w:hAnsi="JetBrains Mono" w:eastAsia="JetBrains Mono" w:cs="JetBrains Mono"/>
+                <w:color w:val="17261F"/>
+                <w:sz w:val="16"/>
+                <w:szCs w:val="16"/>
+              </w:rPr>
+              <w:t xml:space="preserve">  else Real</w:t>
+            </w:r>
+          </w:p>
+          <w:p>
+            <w:pPr>
+              <w:spacing w:before="0" w:after="0" w:line="252" w:lineRule="auto"/>
+            </w:pPr>
+            <w:r>
+              <w:rPr>
+                <w:rFonts w:ascii="JetBrains Mono" w:hAnsi="JetBrains Mono" w:eastAsia="JetBrains Mono" w:cs="JetBrains Mono"/>
+                <w:color w:val="17261F"/>
+                <w:sz w:val="16"/>
+                <w:szCs w:val="16"/>
+              </w:rPr>
+              <w:t xml:space="preserve">    C--&gt;&gt;W: 201 cultivo y credenciales (la clave, una sola vez)</w:t>
+            </w:r>
+          </w:p>
+          <w:p>
+            <w:pPr>
+              <w:spacing w:before="0" w:after="0" w:line="252" w:lineRule="auto"/>
+            </w:pPr>
+            <w:r>
+              <w:rPr>
+                <w:rFonts w:ascii="JetBrains Mono" w:hAnsi="JetBrains Mono" w:eastAsia="JetBrains Mono" w:cs="JetBrains Mono"/>
+                <w:color w:val="17261F"/>
+                <w:sz w:val="16"/>
+                <w:szCs w:val="16"/>
+              </w:rPr>
+              <w:t xml:space="preserve">  end</w:t>
+            </w:r>
+          </w:p>
+          <w:p>
+            <w:pPr>
+              <w:spacing w:before="0" w:after="0" w:line="252" w:lineRule="auto"/>
+            </w:pPr>
+            <w:r>
+              <w:rPr>
+                <w:rFonts w:ascii="JetBrains Mono" w:hAnsi="JetBrains Mono" w:eastAsia="JetBrains Mono" w:cs="JetBrains Mono"/>
+                <w:color w:val="17261F"/>
+                <w:sz w:val="16"/>
+                <w:szCs w:val="16"/>
+              </w:rPr>
+              <w:t xml:space="preserve">  Note over W,S: PUT /crops/{id} con otro kind responde 400&lt;br/&gt;y /device o /device/key de un virtual, también</w:t>
+            </w:r>
+          </w:p>
+        </w:tc>
+      </w:tr>
+    </w:tbl>
+    <w:p>
+      <w:pPr>
+        <w:spacing w:before="160" w:after="0" w:line="240" w:lineRule="auto"/>
+        <w:rPr>
+          <w:sz w:val="8"/>
+        </w:rPr>
+      </w:pPr>
     </w:p>
     <w:p>
       <w:pPr>
@@ -4239,6 +5727,582 @@
     </w:p>
     <w:p>
       <w:pPr>
+        <w:spacing w:before="80" w:after="0" w:line="240" w:lineRule="auto"/>
+        <w:rPr>
+          <w:sz w:val="8"/>
+        </w:rPr>
+      </w:pPr>
+    </w:p>
+    <w:tbl>
+      <w:tblPr>
+        <w:tblW w:w="9360" w:type="dxa"/>
+        <w:tblInd w:w="0" w:type="dxa"/>
+        <w:tblBorders>
+          <w:top w:val="nil"/>
+          <w:left w:val="nil"/>
+          <w:bottom w:val="nil"/>
+          <w:right w:val="nil"/>
+          <w:insideH w:val="nil"/>
+          <w:insideV w:val="nil"/>
+        </w:tblBorders>
+        <w:tblLayout w:type="fixed"/>
+        <w:tblCellMar>
+          <w:left w:w="0" w:type="dxa"/>
+          <w:right w:w="0" w:type="dxa"/>
+        </w:tblCellMar>
+        <w:tblLook w:val="0000" w:firstRow="0" w:lastRow="0" w:firstColumn="0" w:lastColumn="0" w:noHBand="1" w:noVBand="1"/>
+      </w:tblPr>
+      <w:tblGrid>
+        <w:gridCol w:w="9360"/>
+      </w:tblGrid>
+      <w:tr>
+        <w:trPr>
+          <w:cantSplit/>
+        </w:trPr>
+        <w:tc>
+          <w:tcPr>
+            <w:tcW w:w="9360" w:type="dxa"/>
+            <w:shd w:val="clear" w:color="auto" w:fill="0B3D2B"/>
+            <w:tcMar>
+              <w:top w:w="60" w:type="dxa"/>
+              <w:left w:w="200" w:type="dxa"/>
+              <w:bottom w:w="60" w:type="dxa"/>
+              <w:right w:w="200" w:type="dxa"/>
+            </w:tcMar>
+            <w:vAlign w:val="top"/>
+          </w:tcPr>
+          <w:p>
+            <w:pPr>
+              <w:spacing w:before="0" w:after="0" w:line="240" w:lineRule="auto"/>
+            </w:pPr>
+            <w:r>
+              <w:rPr>
+                <w:b/>
+                <w:bCs/>
+                <w:color w:val="7FDBB0"/>
+                <w:spacing w:val="40"/>
+                <w:sz w:val="14"/>
+                <w:szCs w:val="14"/>
+              </w:rPr>
+              <w:t xml:space="preserve">MERMAID</w:t>
+            </w:r>
+          </w:p>
+        </w:tc>
+      </w:tr>
+    </w:tbl>
+    <w:tbl>
+      <w:tblPr>
+        <w:tblW w:w="9360" w:type="dxa"/>
+        <w:tblInd w:w="0" w:type="dxa"/>
+        <w:tblBorders>
+          <w:top w:val="nil"/>
+          <w:left w:val="nil"/>
+          <w:bottom w:val="nil"/>
+          <w:right w:val="nil"/>
+          <w:insideH w:val="nil"/>
+          <w:insideV w:val="nil"/>
+        </w:tblBorders>
+        <w:tblLayout w:type="fixed"/>
+        <w:tblCellMar>
+          <w:left w:w="0" w:type="dxa"/>
+          <w:right w:w="0" w:type="dxa"/>
+        </w:tblCellMar>
+        <w:tblLook w:val="0000" w:firstRow="0" w:lastRow="0" w:firstColumn="0" w:lastColumn="0" w:noHBand="1" w:noVBand="1"/>
+      </w:tblPr>
+      <w:tblGrid>
+        <w:gridCol w:w="9360"/>
+      </w:tblGrid>
+      <w:tr>
+        <w:trPr>
+          <w:cantSplit/>
+        </w:trPr>
+        <w:tc>
+          <w:tcPr>
+            <w:tcW w:w="9360" w:type="dxa"/>
+            <w:shd w:val="clear" w:color="auto" w:fill="F7FAF8"/>
+            <w:tcMar>
+              <w:top w:w="120" w:type="dxa"/>
+              <w:left w:w="200" w:type="dxa"/>
+              <w:bottom w:w="120" w:type="dxa"/>
+              <w:right w:w="200" w:type="dxa"/>
+            </w:tcMar>
+            <w:vAlign w:val="top"/>
+          </w:tcPr>
+          <w:p>
+            <w:pPr>
+              <w:spacing w:before="0" w:after="0" w:line="252" w:lineRule="auto"/>
+            </w:pPr>
+            <w:r>
+              <w:rPr>
+                <w:rFonts w:ascii="JetBrains Mono" w:hAnsi="JetBrains Mono" w:eastAsia="JetBrains Mono" w:cs="JetBrains Mono"/>
+                <w:color w:val="17261F"/>
+                <w:sz w:val="16"/>
+                <w:szCs w:val="16"/>
+              </w:rPr>
+              <w:t xml:space="preserve">%%{init: {"theme": "base", "fontFamily": "Segoe UI, Arial, sans-serif", "themeVariables": {"fontFamily": "Segoe UI, Arial, sans-serif", "fontSize": "15px", "primaryColor": "#DDF5EA", "primaryTextColor": "#17261F", "primaryBorderColor": "#067A52", "secondaryColor": "#E3F2FB", "secondaryTextColor": "#17261F", "secondaryBorderColor": "#1F6FA0", "tertiaryColor": "#F2F7F4", "tertiaryTextColor": "#17261F", "tertiaryBorderColor": "#D5E3DC", "lineColor": "#5B6B63", "textColor": "#17261F", "mainBkg": "#DDF5EA", "nodeBorder": "#067A52", "clusterBkg": "#F7FAF8", "clusterBorder": "#D5E3DC", "edgeLabelBackground": "#FFFFFF", "actorBkg": "#067A52", "actorBorder": "#0B3D2B", "actorTextColor": "#FFFFFF", "actorLineColor": "#5B6B63", "signalColor": "#17261F", "signalTextColor": "#17261F", "labelBoxBkgColor": "#0B3D2B", "labelBoxBorderColor": "#0B3D2B", "labelTextColor": "#FFFFFF", "loopTextColor": "#0B3D2B", "noteBkgColor": "#FDF4DD", "noteBorderColor": "#C98D12", "noteTextColor": "#17261F", "activationBkgColor": "#DDF5EA", "activationBorderColor": "#067A52", "attributeBackgroundColorOdd": "#FFFFFF", "attributeBackgroundColorEven": "#F2F7F4"}}}%%</w:t>
+            </w:r>
+          </w:p>
+          <w:p>
+            <w:pPr>
+              <w:spacing w:before="0" w:after="0" w:line="252" w:lineRule="auto"/>
+            </w:pPr>
+            <w:r>
+              <w:rPr>
+                <w:rFonts w:ascii="JetBrains Mono" w:hAnsi="JetBrains Mono" w:eastAsia="JetBrains Mono" w:cs="JetBrains Mono"/>
+                <w:color w:val="17261F"/>
+                <w:sz w:val="16"/>
+                <w:szCs w:val="16"/>
+              </w:rPr>
+              <w:t xml:space="preserve">sequenceDiagram</w:t>
+            </w:r>
+          </w:p>
+          <w:p>
+            <w:pPr>
+              <w:spacing w:before="0" w:after="0" w:line="252" w:lineRule="auto"/>
+            </w:pPr>
+            <w:r>
+              <w:rPr>
+                <w:rFonts w:ascii="JetBrains Mono" w:hAnsi="JetBrains Mono" w:eastAsia="JetBrains Mono" w:cs="JetBrains Mono"/>
+                <w:color w:val="17261F"/>
+                <w:sz w:val="16"/>
+                <w:szCs w:val="16"/>
+              </w:rPr>
+              <w:t xml:space="preserve">  autonumber</w:t>
+            </w:r>
+          </w:p>
+          <w:p>
+            <w:pPr>
+              <w:spacing w:before="0" w:after="0" w:line="252" w:lineRule="auto"/>
+            </w:pPr>
+            <w:r>
+              <w:rPr>
+                <w:rFonts w:ascii="JetBrains Mono" w:hAnsi="JetBrains Mono" w:eastAsia="JetBrains Mono" w:cs="JetBrains Mono"/>
+                <w:color w:val="17261F"/>
+                <w:sz w:val="16"/>
+                <w:szCs w:val="16"/>
+              </w:rPr>
+              <w:t xml:space="preserve">  participant B as Broker</w:t>
+            </w:r>
+          </w:p>
+          <w:p>
+            <w:pPr>
+              <w:spacing w:before="0" w:after="0" w:line="252" w:lineRule="auto"/>
+            </w:pPr>
+            <w:r>
+              <w:rPr>
+                <w:rFonts w:ascii="JetBrains Mono" w:hAnsi="JetBrains Mono" w:eastAsia="JetBrains Mono" w:cs="JetBrains Mono"/>
+                <w:color w:val="17261F"/>
+                <w:sz w:val="16"/>
+                <w:szCs w:val="16"/>
+              </w:rPr>
+              <w:t xml:space="preserve">  participant H as MqttMessageHandler</w:t>
+            </w:r>
+          </w:p>
+          <w:p>
+            <w:pPr>
+              <w:spacing w:before="0" w:after="0" w:line="252" w:lineRule="auto"/>
+            </w:pPr>
+            <w:r>
+              <w:rPr>
+                <w:rFonts w:ascii="JetBrains Mono" w:hAnsi="JetBrains Mono" w:eastAsia="JetBrains Mono" w:cs="JetBrains Mono"/>
+                <w:color w:val="17261F"/>
+                <w:sz w:val="16"/>
+                <w:szCs w:val="16"/>
+              </w:rPr>
+              <w:t xml:space="preserve">  participant R as ReadingService</w:t>
+            </w:r>
+          </w:p>
+          <w:p>
+            <w:pPr>
+              <w:spacing w:before="0" w:after="0" w:line="252" w:lineRule="auto"/>
+            </w:pPr>
+            <w:r>
+              <w:rPr>
+                <w:rFonts w:ascii="JetBrains Mono" w:hAnsi="JetBrains Mono" w:eastAsia="JetBrains Mono" w:cs="JetBrains Mono"/>
+                <w:color w:val="17261F"/>
+                <w:sz w:val="16"/>
+                <w:szCs w:val="16"/>
+              </w:rPr>
+              <w:t xml:space="preserve">  participant K as Redis</w:t>
+            </w:r>
+          </w:p>
+          <w:p>
+            <w:pPr>
+              <w:spacing w:before="0" w:after="0" w:line="252" w:lineRule="auto"/>
+            </w:pPr>
+            <w:r>
+              <w:rPr>
+                <w:rFonts w:ascii="JetBrains Mono" w:hAnsi="JetBrains Mono" w:eastAsia="JetBrains Mono" w:cs="JetBrains Mono"/>
+                <w:color w:val="17261F"/>
+                <w:sz w:val="16"/>
+                <w:szCs w:val="16"/>
+              </w:rPr>
+              <w:t xml:space="preserve">  participant D as MongoDB</w:t>
+            </w:r>
+          </w:p>
+          <w:p>
+            <w:pPr>
+              <w:spacing w:before="0" w:after="0" w:line="252" w:lineRule="auto"/>
+            </w:pPr>
+            <w:r>
+              <w:rPr>
+                <w:rFonts w:ascii="JetBrains Mono" w:hAnsi="JetBrains Mono" w:eastAsia="JetBrains Mono" w:cs="JetBrains Mono"/>
+                <w:color w:val="17261F"/>
+                <w:sz w:val="16"/>
+                <w:szCs w:val="16"/>
+              </w:rPr>
+              <w:t xml:space="preserve">  participant L as LearningFeed</w:t>
+            </w:r>
+          </w:p>
+          <w:p>
+            <w:pPr>
+              <w:spacing w:before="0" w:after="0" w:line="252" w:lineRule="auto"/>
+            </w:pPr>
+            <w:r>
+              <w:rPr>
+                <w:rFonts w:ascii="JetBrains Mono" w:hAnsi="JetBrains Mono" w:eastAsia="JetBrains Mono" w:cs="JetBrains Mono"/>
+                <w:color w:val="17261F"/>
+                <w:sz w:val="16"/>
+                <w:szCs w:val="16"/>
+              </w:rPr>
+              <w:t xml:space="preserve">  participant G as AutomationAgent</w:t>
+            </w:r>
+          </w:p>
+          <w:p>
+            <w:pPr>
+              <w:spacing w:before="0" w:after="0" w:line="252" w:lineRule="auto"/>
+            </w:pPr>
+            <w:r>
+              <w:rPr>
+                <w:rFonts w:ascii="JetBrains Mono" w:hAnsi="JetBrains Mono" w:eastAsia="JetBrains Mono" w:cs="JetBrains Mono"/>
+                <w:color w:val="17261F"/>
+                <w:sz w:val="16"/>
+                <w:szCs w:val="16"/>
+              </w:rPr>
+              <w:t xml:space="preserve">  participant I as SmartPot-AI</w:t>
+            </w:r>
+          </w:p>
+          <w:p>
+            <w:pPr>
+              <w:spacing w:before="0" w:after="0" w:line="252" w:lineRule="auto"/>
+            </w:pPr>
+            <w:r>
+              <w:rPr>
+                <w:rFonts w:ascii="JetBrains Mono" w:hAnsi="JetBrains Mono" w:eastAsia="JetBrains Mono" w:cs="JetBrains Mono"/>
+                <w:color w:val="17261F"/>
+                <w:sz w:val="16"/>
+                <w:szCs w:val="16"/>
+              </w:rPr>
+              <w:t xml:space="preserve">  participant M as CommandService</w:t>
+            </w:r>
+          </w:p>
+          <w:p>
+            <w:pPr>
+              <w:spacing w:before="0" w:after="0" w:line="252" w:lineRule="auto"/>
+            </w:pPr>
+            <w:r>
+              <w:rPr>
+                <w:rFonts w:ascii="JetBrains Mono" w:hAnsi="JetBrains Mono" w:eastAsia="JetBrains Mono" w:cs="JetBrains Mono"/>
+                <w:color w:val="17261F"/>
+                <w:sz w:val="16"/>
+                <w:szCs w:val="16"/>
+              </w:rPr>
+              <w:t xml:space="preserve">  B-&gt;&gt;H: smartpot/v1/{cropId}/telemetry</w:t>
+            </w:r>
+          </w:p>
+          <w:p>
+            <w:pPr>
+              <w:spacing w:before="0" w:after="0" w:line="252" w:lineRule="auto"/>
+            </w:pPr>
+            <w:r>
+              <w:rPr>
+                <w:rFonts w:ascii="JetBrains Mono" w:hAnsi="JetBrains Mono" w:eastAsia="JetBrains Mono" w:cs="JetBrains Mono"/>
+                <w:color w:val="17261F"/>
+                <w:sz w:val="16"/>
+                <w:szCs w:val="16"/>
+              </w:rPr>
+              <w:t xml:space="preserve">  H-&gt;&gt;R: TelemetryParser → recordFromDevice</w:t>
+            </w:r>
+          </w:p>
+          <w:p>
+            <w:pPr>
+              <w:spacing w:before="0" w:after="0" w:line="252" w:lineRule="auto"/>
+            </w:pPr>
+            <w:r>
+              <w:rPr>
+                <w:rFonts w:ascii="JetBrains Mono" w:hAnsi="JetBrains Mono" w:eastAsia="JetBrains Mono" w:cs="JetBrains Mono"/>
+                <w:color w:val="17261F"/>
+                <w:sz w:val="16"/>
+                <w:szCs w:val="16"/>
+              </w:rPr>
+              <w:t xml:space="preserve">  R-&gt;&gt;K: SET NX reading:cropId (5 s)</w:t>
+            </w:r>
+          </w:p>
+          <w:p>
+            <w:pPr>
+              <w:spacing w:before="0" w:after="0" w:line="252" w:lineRule="auto"/>
+            </w:pPr>
+            <w:r>
+              <w:rPr>
+                <w:rFonts w:ascii="JetBrains Mono" w:hAnsi="JetBrains Mono" w:eastAsia="JetBrains Mono" w:cs="JetBrains Mono"/>
+                <w:color w:val="17261F"/>
+                <w:sz w:val="16"/>
+                <w:szCs w:val="16"/>
+              </w:rPr>
+              <w:t xml:space="preserve">  R-&gt;&gt;R: MeasureRanges: fuera del rango físico se descarta</w:t>
+            </w:r>
+          </w:p>
+          <w:p>
+            <w:pPr>
+              <w:spacing w:before="0" w:after="0" w:line="252" w:lineRule="auto"/>
+            </w:pPr>
+            <w:r>
+              <w:rPr>
+                <w:rFonts w:ascii="JetBrains Mono" w:hAnsi="JetBrains Mono" w:eastAsia="JetBrains Mono" w:cs="JetBrains Mono"/>
+                <w:color w:val="17261F"/>
+                <w:sz w:val="16"/>
+                <w:szCs w:val="16"/>
+              </w:rPr>
+              <w:t xml:space="preserve">  R-&gt;&gt;D: readings</w:t>
+            </w:r>
+          </w:p>
+          <w:p>
+            <w:pPr>
+              <w:spacing w:before="0" w:after="0" w:line="252" w:lineRule="auto"/>
+            </w:pPr>
+            <w:r>
+              <w:rPr>
+                <w:rFonts w:ascii="JetBrains Mono" w:hAnsi="JetBrains Mono" w:eastAsia="JetBrains Mono" w:cs="JetBrains Mono"/>
+                <w:color w:val="17261F"/>
+                <w:sz w:val="16"/>
+                <w:szCs w:val="16"/>
+              </w:rPr>
+              <w:t xml:space="preserve">  R-)L: ReadingRecordedEvent</w:t>
+            </w:r>
+          </w:p>
+          <w:p>
+            <w:pPr>
+              <w:spacing w:before="0" w:after="0" w:line="252" w:lineRule="auto"/>
+            </w:pPr>
+            <w:r>
+              <w:rPr>
+                <w:rFonts w:ascii="JetBrains Mono" w:hAnsi="JetBrains Mono" w:eastAsia="JetBrains Mono" w:cs="JetBrains Mono"/>
+                <w:color w:val="17261F"/>
+                <w:sz w:val="16"/>
+                <w:szCs w:val="16"/>
+              </w:rPr>
+              <w:t xml:space="preserve">  L-&gt;&gt;L: encola solo si el cultivo es real</w:t>
+            </w:r>
+          </w:p>
+          <w:p>
+            <w:pPr>
+              <w:spacing w:before="0" w:after="0" w:line="252" w:lineRule="auto"/>
+            </w:pPr>
+            <w:r>
+              <w:rPr>
+                <w:rFonts w:ascii="JetBrains Mono" w:hAnsi="JetBrains Mono" w:eastAsia="JetBrains Mono" w:cs="JetBrains Mono"/>
+                <w:color w:val="17261F"/>
+                <w:sz w:val="16"/>
+                <w:szCs w:val="16"/>
+              </w:rPr>
+              <w:t xml:space="preserve">  R-)G: ReadingRecordedEvent</w:t>
+            </w:r>
+          </w:p>
+          <w:p>
+            <w:pPr>
+              <w:spacing w:before="0" w:after="0" w:line="252" w:lineRule="auto"/>
+            </w:pPr>
+            <w:r>
+              <w:rPr>
+                <w:rFonts w:ascii="JetBrains Mono" w:hAnsi="JetBrains Mono" w:eastAsia="JetBrains Mono" w:cs="JetBrains Mono"/>
+                <w:color w:val="17261F"/>
+                <w:sz w:val="16"/>
+                <w:szCs w:val="16"/>
+              </w:rPr>
+              <w:t xml:space="preserve">  G-&gt;&gt;K: SET NX ai-eval:cropId (30 s con automático, 5 min sin él)</w:t>
+            </w:r>
+          </w:p>
+          <w:p>
+            <w:pPr>
+              <w:spacing w:before="0" w:after="0" w:line="252" w:lineRule="auto"/>
+            </w:pPr>
+            <w:r>
+              <w:rPr>
+                <w:rFonts w:ascii="JetBrains Mono" w:hAnsi="JetBrains Mono" w:eastAsia="JetBrains Mono" w:cs="JetBrains Mono"/>
+                <w:color w:val="17261F"/>
+                <w:sz w:val="16"/>
+                <w:szCs w:val="16"/>
+              </w:rPr>
+              <w:t xml:space="preserve">  G-&gt;&gt;I: POST /v1/insights · lectura, historial, actuadores y hora</w:t>
+            </w:r>
+          </w:p>
+          <w:p>
+            <w:pPr>
+              <w:spacing w:before="0" w:after="0" w:line="252" w:lineRule="auto"/>
+            </w:pPr>
+            <w:r>
+              <w:rPr>
+                <w:rFonts w:ascii="JetBrains Mono" w:hAnsi="JetBrains Mono" w:eastAsia="JetBrains Mono" w:cs="JetBrains Mono"/>
+                <w:color w:val="17261F"/>
+                <w:sz w:val="16"/>
+                <w:szCs w:val="16"/>
+              </w:rPr>
+              <w:t xml:space="preserve">  I--&gt;&gt;G: salud, diagnóstico, predicciones y acciones</w:t>
+            </w:r>
+          </w:p>
+          <w:p>
+            <w:pPr>
+              <w:spacing w:before="0" w:after="0" w:line="252" w:lineRule="auto"/>
+            </w:pPr>
+            <w:r>
+              <w:rPr>
+                <w:rFonts w:ascii="JetBrains Mono" w:hAnsi="JetBrains Mono" w:eastAsia="JetBrains Mono" w:cs="JetBrains Mono"/>
+                <w:color w:val="17261F"/>
+                <w:sz w:val="16"/>
+                <w:szCs w:val="16"/>
+              </w:rPr>
+              <w:t xml:space="preserve">  G-&gt;&gt;D: crops.health</w:t>
+            </w:r>
+          </w:p>
+          <w:p>
+            <w:pPr>
+              <w:spacing w:before="0" w:after="0" w:line="252" w:lineRule="auto"/>
+            </w:pPr>
+            <w:r>
+              <w:rPr>
+                <w:rFonts w:ascii="JetBrains Mono" w:hAnsi="JetBrains Mono" w:eastAsia="JetBrains Mono" w:cs="JetBrains Mono"/>
+                <w:color w:val="17261F"/>
+                <w:sz w:val="16"/>
+                <w:szCs w:val="16"/>
+              </w:rPr>
+              <w:t xml:space="preserve">  opt Modo automático</w:t>
+            </w:r>
+          </w:p>
+          <w:p>
+            <w:pPr>
+              <w:spacing w:before="0" w:after="0" w:line="252" w:lineRule="auto"/>
+            </w:pPr>
+            <w:r>
+              <w:rPr>
+                <w:rFonts w:ascii="JetBrains Mono" w:hAnsi="JetBrains Mono" w:eastAsia="JetBrains Mono" w:cs="JetBrains Mono"/>
+                <w:color w:val="17261F"/>
+                <w:sz w:val="16"/>
+                <w:szCs w:val="16"/>
+              </w:rPr>
+              <w:t xml:space="preserve">    G-&gt;&gt;K: SET NX agent:cropId:actuador (10 min)</w:t>
+            </w:r>
+          </w:p>
+          <w:p>
+            <w:pPr>
+              <w:spacing w:before="0" w:after="0" w:line="252" w:lineRule="auto"/>
+            </w:pPr>
+            <w:r>
+              <w:rPr>
+                <w:rFonts w:ascii="JetBrains Mono" w:hAnsi="JetBrains Mono" w:eastAsia="JetBrains Mono" w:cs="JetBrains Mono"/>
+                <w:color w:val="17261F"/>
+                <w:sz w:val="16"/>
+                <w:szCs w:val="16"/>
+              </w:rPr>
+              <w:t xml:space="preserve">    G-&gt;&gt;M: dispatch (origen AGENT)</w:t>
+            </w:r>
+          </w:p>
+          <w:p>
+            <w:pPr>
+              <w:spacing w:before="0" w:after="0" w:line="252" w:lineRule="auto"/>
+            </w:pPr>
+            <w:r>
+              <w:rPr>
+                <w:rFonts w:ascii="JetBrains Mono" w:hAnsi="JetBrains Mono" w:eastAsia="JetBrains Mono" w:cs="JetBrains Mono"/>
+                <w:color w:val="17261F"/>
+                <w:sz w:val="16"/>
+                <w:szCs w:val="16"/>
+              </w:rPr>
+              <w:t xml:space="preserve">    M-&gt;&gt;D: commands PENDING → SENT</w:t>
+            </w:r>
+          </w:p>
+          <w:p>
+            <w:pPr>
+              <w:spacing w:before="0" w:after="0" w:line="252" w:lineRule="auto"/>
+            </w:pPr>
+            <w:r>
+              <w:rPr>
+                <w:rFonts w:ascii="JetBrains Mono" w:hAnsi="JetBrains Mono" w:eastAsia="JetBrains Mono" w:cs="JetBrains Mono"/>
+                <w:color w:val="17261F"/>
+                <w:sz w:val="16"/>
+                <w:szCs w:val="16"/>
+              </w:rPr>
+              <w:t xml:space="preserve">    M-&gt;&gt;B: smartpot/v1/{cropId}/commands (QoS 1)</w:t>
+            </w:r>
+          </w:p>
+          <w:p>
+            <w:pPr>
+              <w:spacing w:before="0" w:after="0" w:line="252" w:lineRule="auto"/>
+            </w:pPr>
+            <w:r>
+              <w:rPr>
+                <w:rFonts w:ascii="JetBrains Mono" w:hAnsi="JetBrains Mono" w:eastAsia="JetBrains Mono" w:cs="JetBrains Mono"/>
+                <w:color w:val="17261F"/>
+                <w:sz w:val="16"/>
+                <w:szCs w:val="16"/>
+              </w:rPr>
+              <w:t xml:space="preserve">    B-&gt;&gt;H: commands/ack EXECUTED o FAILED</w:t>
+            </w:r>
+          </w:p>
+          <w:p>
+            <w:pPr>
+              <w:spacing w:before="0" w:after="0" w:line="252" w:lineRule="auto"/>
+            </w:pPr>
+            <w:r>
+              <w:rPr>
+                <w:rFonts w:ascii="JetBrains Mono" w:hAnsi="JetBrains Mono" w:eastAsia="JetBrains Mono" w:cs="JetBrains Mono"/>
+                <w:color w:val="17261F"/>
+                <w:sz w:val="16"/>
+                <w:szCs w:val="16"/>
+              </w:rPr>
+              <w:t xml:space="preserve">    H-&gt;&gt;M: confirma y actualiza el actuador</w:t>
+            </w:r>
+          </w:p>
+          <w:p>
+            <w:pPr>
+              <w:spacing w:before="0" w:after="0" w:line="252" w:lineRule="auto"/>
+            </w:pPr>
+            <w:r>
+              <w:rPr>
+                <w:rFonts w:ascii="JetBrains Mono" w:hAnsi="JetBrains Mono" w:eastAsia="JetBrains Mono" w:cs="JetBrains Mono"/>
+                <w:color w:val="17261F"/>
+                <w:sz w:val="16"/>
+                <w:szCs w:val="16"/>
+              </w:rPr>
+              <w:t xml:space="preserve">  end</w:t>
+            </w:r>
+          </w:p>
+          <w:p>
+            <w:pPr>
+              <w:spacing w:before="0" w:after="0" w:line="252" w:lineRule="auto"/>
+            </w:pPr>
+            <w:r>
+              <w:rPr>
+                <w:rFonts w:ascii="JetBrains Mono" w:hAnsi="JetBrains Mono" w:eastAsia="JetBrains Mono" w:cs="JetBrains Mono"/>
+                <w:color w:val="17261F"/>
+                <w:sz w:val="16"/>
+                <w:szCs w:val="16"/>
+              </w:rPr>
+              <w:t xml:space="preserve">  Note over L,I: Cada minuto LearningFeed envía el lote&lt;br/&gt;a POST /v1/learning/readings</w:t>
+            </w:r>
+          </w:p>
+        </w:tc>
+      </w:tr>
+    </w:tbl>
+    <w:p>
+      <w:pPr>
+        <w:spacing w:before="160" w:after="0" w:line="240" w:lineRule="auto"/>
+        <w:rPr>
+          <w:sz w:val="8"/>
+        </w:rPr>
+      </w:pPr>
+    </w:p>
+    <w:p>
+      <w:pPr>
         <w:keepNext/>
         <w:spacing w:before="60" w:after="0" w:line="240" w:lineRule="auto"/>
         <w:rPr>
@@ -4817,6 +6881,526 @@
     </w:p>
     <w:p>
       <w:pPr>
+        <w:spacing w:before="80" w:after="0" w:line="240" w:lineRule="auto"/>
+        <w:rPr>
+          <w:sz w:val="8"/>
+        </w:rPr>
+      </w:pPr>
+    </w:p>
+    <w:tbl>
+      <w:tblPr>
+        <w:tblW w:w="9360" w:type="dxa"/>
+        <w:tblInd w:w="0" w:type="dxa"/>
+        <w:tblBorders>
+          <w:top w:val="nil"/>
+          <w:left w:val="nil"/>
+          <w:bottom w:val="nil"/>
+          <w:right w:val="nil"/>
+          <w:insideH w:val="nil"/>
+          <w:insideV w:val="nil"/>
+        </w:tblBorders>
+        <w:tblLayout w:type="fixed"/>
+        <w:tblCellMar>
+          <w:left w:w="0" w:type="dxa"/>
+          <w:right w:w="0" w:type="dxa"/>
+        </w:tblCellMar>
+        <w:tblLook w:val="0000" w:firstRow="0" w:lastRow="0" w:firstColumn="0" w:lastColumn="0" w:noHBand="1" w:noVBand="1"/>
+      </w:tblPr>
+      <w:tblGrid>
+        <w:gridCol w:w="9360"/>
+      </w:tblGrid>
+      <w:tr>
+        <w:trPr>
+          <w:cantSplit/>
+        </w:trPr>
+        <w:tc>
+          <w:tcPr>
+            <w:tcW w:w="9360" w:type="dxa"/>
+            <w:shd w:val="clear" w:color="auto" w:fill="0B3D2B"/>
+            <w:tcMar>
+              <w:top w:w="60" w:type="dxa"/>
+              <w:left w:w="200" w:type="dxa"/>
+              <w:bottom w:w="60" w:type="dxa"/>
+              <w:right w:w="200" w:type="dxa"/>
+            </w:tcMar>
+            <w:vAlign w:val="top"/>
+          </w:tcPr>
+          <w:p>
+            <w:pPr>
+              <w:spacing w:before="0" w:after="0" w:line="240" w:lineRule="auto"/>
+            </w:pPr>
+            <w:r>
+              <w:rPr>
+                <w:b/>
+                <w:bCs/>
+                <w:color w:val="7FDBB0"/>
+                <w:spacing w:val="40"/>
+                <w:sz w:val="14"/>
+                <w:szCs w:val="14"/>
+              </w:rPr>
+              <w:t xml:space="preserve">MERMAID</w:t>
+            </w:r>
+          </w:p>
+        </w:tc>
+      </w:tr>
+    </w:tbl>
+    <w:tbl>
+      <w:tblPr>
+        <w:tblW w:w="9360" w:type="dxa"/>
+        <w:tblInd w:w="0" w:type="dxa"/>
+        <w:tblBorders>
+          <w:top w:val="nil"/>
+          <w:left w:val="nil"/>
+          <w:bottom w:val="nil"/>
+          <w:right w:val="nil"/>
+          <w:insideH w:val="nil"/>
+          <w:insideV w:val="nil"/>
+        </w:tblBorders>
+        <w:tblLayout w:type="fixed"/>
+        <w:tblCellMar>
+          <w:left w:w="0" w:type="dxa"/>
+          <w:right w:w="0" w:type="dxa"/>
+        </w:tblCellMar>
+        <w:tblLook w:val="0000" w:firstRow="0" w:lastRow="0" w:firstColumn="0" w:lastColumn="0" w:noHBand="1" w:noVBand="1"/>
+      </w:tblPr>
+      <w:tblGrid>
+        <w:gridCol w:w="9360"/>
+      </w:tblGrid>
+      <w:tr>
+        <w:trPr>
+          <w:cantSplit/>
+        </w:trPr>
+        <w:tc>
+          <w:tcPr>
+            <w:tcW w:w="9360" w:type="dxa"/>
+            <w:shd w:val="clear" w:color="auto" w:fill="F7FAF8"/>
+            <w:tcMar>
+              <w:top w:w="120" w:type="dxa"/>
+              <w:left w:w="200" w:type="dxa"/>
+              <w:bottom w:w="120" w:type="dxa"/>
+              <w:right w:w="200" w:type="dxa"/>
+            </w:tcMar>
+            <w:vAlign w:val="top"/>
+          </w:tcPr>
+          <w:p>
+            <w:pPr>
+              <w:spacing w:before="0" w:after="0" w:line="252" w:lineRule="auto"/>
+            </w:pPr>
+            <w:r>
+              <w:rPr>
+                <w:rFonts w:ascii="JetBrains Mono" w:hAnsi="JetBrains Mono" w:eastAsia="JetBrains Mono" w:cs="JetBrains Mono"/>
+                <w:color w:val="17261F"/>
+                <w:sz w:val="16"/>
+                <w:szCs w:val="16"/>
+              </w:rPr>
+              <w:t xml:space="preserve">%%{init: {"theme": "base", "fontFamily": "Segoe UI, Arial, sans-serif", "themeVariables": {"fontFamily": "Segoe UI, Arial, sans-serif", "fontSize": "15px", "primaryColor": "#DDF5EA", "primaryTextColor": "#17261F", "primaryBorderColor": "#067A52", "secondaryColor": "#E3F2FB", "secondaryTextColor": "#17261F", "secondaryBorderColor": "#1F6FA0", "tertiaryColor": "#F2F7F4", "tertiaryTextColor": "#17261F", "tertiaryBorderColor": "#D5E3DC", "lineColor": "#5B6B63", "textColor": "#17261F", "mainBkg": "#DDF5EA", "nodeBorder": "#067A52", "clusterBkg": "#F7FAF8", "clusterBorder": "#D5E3DC", "edgeLabelBackground": "#FFFFFF", "actorBkg": "#067A52", "actorBorder": "#0B3D2B", "actorTextColor": "#FFFFFF", "actorLineColor": "#5B6B63", "signalColor": "#17261F", "signalTextColor": "#17261F", "labelBoxBkgColor": "#0B3D2B", "labelBoxBorderColor": "#0B3D2B", "labelTextColor": "#FFFFFF", "loopTextColor": "#0B3D2B", "noteBkgColor": "#FDF4DD", "noteBorderColor": "#C98D12", "noteTextColor": "#17261F", "activationBkgColor": "#DDF5EA", "activationBorderColor": "#067A52", "attributeBackgroundColorOdd": "#FFFFFF", "attributeBackgroundColorEven": "#F2F7F4"}}}%%</w:t>
+            </w:r>
+          </w:p>
+          <w:p>
+            <w:pPr>
+              <w:spacing w:before="0" w:after="0" w:line="252" w:lineRule="auto"/>
+            </w:pPr>
+            <w:r>
+              <w:rPr>
+                <w:rFonts w:ascii="JetBrains Mono" w:hAnsi="JetBrains Mono" w:eastAsia="JetBrains Mono" w:cs="JetBrains Mono"/>
+                <w:color w:val="17261F"/>
+                <w:sz w:val="16"/>
+                <w:szCs w:val="16"/>
+              </w:rPr>
+              <w:t xml:space="preserve">flowchart TB</w:t>
+            </w:r>
+          </w:p>
+          <w:p>
+            <w:pPr>
+              <w:spacing w:before="0" w:after="0" w:line="252" w:lineRule="auto"/>
+            </w:pPr>
+            <w:r>
+              <w:rPr>
+                <w:rFonts w:ascii="JetBrains Mono" w:hAnsi="JetBrains Mono" w:eastAsia="JetBrains Mono" w:cs="JetBrains Mono"/>
+                <w:color w:val="17261F"/>
+                <w:sz w:val="16"/>
+                <w:szCs w:val="16"/>
+              </w:rPr>
+              <w:t xml:space="preserve">  req(["Petición HTTP"]) --&gt; cors{"¿Origen permitido?&lt;br/&gt;CORS_ALLOWED_ORIGINS"}</w:t>
+            </w:r>
+          </w:p>
+          <w:p>
+            <w:pPr>
+              <w:spacing w:before="0" w:after="0" w:line="252" w:lineRule="auto"/>
+            </w:pPr>
+            <w:r>
+              <w:rPr>
+                <w:rFonts w:ascii="JetBrains Mono" w:hAnsi="JetBrains Mono" w:eastAsia="JetBrains Mono" w:cs="JetBrains Mono"/>
+                <w:color w:val="17261F"/>
+                <w:sz w:val="16"/>
+                <w:szCs w:val="16"/>
+              </w:rPr>
+              <w:t xml:space="preserve">  cors --&gt;|"No"| r403["403"]</w:t>
+            </w:r>
+          </w:p>
+          <w:p>
+            <w:pPr>
+              <w:spacing w:before="0" w:after="0" w:line="252" w:lineRule="auto"/>
+            </w:pPr>
+            <w:r>
+              <w:rPr>
+                <w:rFonts w:ascii="JetBrains Mono" w:hAnsi="JetBrains Mono" w:eastAsia="JetBrains Mono" w:cs="JetBrains Mono"/>
+                <w:color w:val="17261F"/>
+                <w:sz w:val="16"/>
+                <w:szCs w:val="16"/>
+              </w:rPr>
+              <w:t xml:space="preserve">  cors --&gt;|"Sí"| rate{"¿Dentro del límite?&lt;br/&gt;300/min por IP · 10/min en /auth"}</w:t>
+            </w:r>
+          </w:p>
+          <w:p>
+            <w:pPr>
+              <w:spacing w:before="0" w:after="0" w:line="252" w:lineRule="auto"/>
+            </w:pPr>
+            <w:r>
+              <w:rPr>
+                <w:rFonts w:ascii="JetBrains Mono" w:hAnsi="JetBrains Mono" w:eastAsia="JetBrains Mono" w:cs="JetBrains Mono"/>
+                <w:color w:val="17261F"/>
+                <w:sz w:val="16"/>
+                <w:szCs w:val="16"/>
+              </w:rPr>
+              <w:t xml:space="preserve">  rate --&gt;|"No"| r429["429 con Retry-After"]</w:t>
+            </w:r>
+          </w:p>
+          <w:p>
+            <w:pPr>
+              <w:spacing w:before="0" w:after="0" w:line="252" w:lineRule="auto"/>
+            </w:pPr>
+            <w:r>
+              <w:rPr>
+                <w:rFonts w:ascii="JetBrains Mono" w:hAnsi="JetBrains Mono" w:eastAsia="JetBrains Mono" w:cs="JetBrains Mono"/>
+                <w:color w:val="17261F"/>
+                <w:sz w:val="16"/>
+                <w:szCs w:val="16"/>
+              </w:rPr>
+              <w:t xml:space="preserve">  rate --&gt;|"Sí"| pub{"¿Ruta pública?&lt;br/&gt;/health · /auth · /crop-profiles · webhook"}</w:t>
+            </w:r>
+          </w:p>
+          <w:p>
+            <w:pPr>
+              <w:spacing w:before="0" w:after="0" w:line="252" w:lineRule="auto"/>
+            </w:pPr>
+            <w:r>
+              <w:rPr>
+                <w:rFonts w:ascii="JetBrains Mono" w:hAnsi="JetBrains Mono" w:eastAsia="JetBrains Mono" w:cs="JetBrains Mono"/>
+                <w:color w:val="17261F"/>
+                <w:sz w:val="16"/>
+                <w:szCs w:val="16"/>
+              </w:rPr>
+              <w:t xml:space="preserve">  pub --&gt;|"Sí"| ctrl["Controlador"]</w:t>
+            </w:r>
+          </w:p>
+          <w:p>
+            <w:pPr>
+              <w:spacing w:before="0" w:after="0" w:line="252" w:lineRule="auto"/>
+            </w:pPr>
+            <w:r>
+              <w:rPr>
+                <w:rFonts w:ascii="JetBrains Mono" w:hAnsi="JetBrains Mono" w:eastAsia="JetBrains Mono" w:cs="JetBrains Mono"/>
+                <w:color w:val="17261F"/>
+                <w:sz w:val="16"/>
+                <w:szCs w:val="16"/>
+              </w:rPr>
+              <w:t xml:space="preserve">  pub --&gt;|"No"| jwt{"¿JWT válido?&lt;br/&gt;HS256 · 7 días"}</w:t>
+            </w:r>
+          </w:p>
+          <w:p>
+            <w:pPr>
+              <w:spacing w:before="0" w:after="0" w:line="252" w:lineRule="auto"/>
+            </w:pPr>
+            <w:r>
+              <w:rPr>
+                <w:rFonts w:ascii="JetBrains Mono" w:hAnsi="JetBrains Mono" w:eastAsia="JetBrains Mono" w:cs="JetBrains Mono"/>
+                <w:color w:val="17261F"/>
+                <w:sz w:val="16"/>
+                <w:szCs w:val="16"/>
+              </w:rPr>
+              <w:t xml:space="preserve">  jwt --&gt;|"No"| r401["401"]</w:t>
+            </w:r>
+          </w:p>
+          <w:p>
+            <w:pPr>
+              <w:spacing w:before="0" w:after="0" w:line="252" w:lineRule="auto"/>
+            </w:pPr>
+            <w:r>
+              <w:rPr>
+                <w:rFonts w:ascii="JetBrains Mono" w:hAnsi="JetBrains Mono" w:eastAsia="JetBrains Mono" w:cs="JetBrains Mono"/>
+                <w:color w:val="17261F"/>
+                <w:sz w:val="16"/>
+                <w:szCs w:val="16"/>
+              </w:rPr>
+              <w:t xml:space="preserve">  jwt --&gt;|"Sí"| ctrl</w:t>
+            </w:r>
+          </w:p>
+          <w:p>
+            <w:pPr>
+              <w:spacing w:before="0" w:after="0" w:line="252" w:lineRule="auto"/>
+            </w:pPr>
+            <w:r>
+              <w:rPr>
+                <w:rFonts w:ascii="JetBrains Mono" w:hAnsi="JetBrains Mono" w:eastAsia="JetBrains Mono" w:cs="JetBrains Mono"/>
+                <w:color w:val="17261F"/>
+                <w:sz w:val="16"/>
+                <w:szCs w:val="16"/>
+              </w:rPr>
+              <w:t xml:space="preserve">  ctrl --&gt; valid{"¿Datos válidos?&lt;br/&gt;Bean Validation"}</w:t>
+            </w:r>
+          </w:p>
+          <w:p>
+            <w:pPr>
+              <w:spacing w:before="0" w:after="0" w:line="252" w:lineRule="auto"/>
+            </w:pPr>
+            <w:r>
+              <w:rPr>
+                <w:rFonts w:ascii="JetBrains Mono" w:hAnsi="JetBrains Mono" w:eastAsia="JetBrains Mono" w:cs="JetBrains Mono"/>
+                <w:color w:val="17261F"/>
+                <w:sz w:val="16"/>
+                <w:szCs w:val="16"/>
+              </w:rPr>
+              <w:t xml:space="preserve">  valid --&gt;|"No"| r400["400 con fields en español"]</w:t>
+            </w:r>
+          </w:p>
+          <w:p>
+            <w:pPr>
+              <w:spacing w:before="0" w:after="0" w:line="252" w:lineRule="auto"/>
+            </w:pPr>
+            <w:r>
+              <w:rPr>
+                <w:rFonts w:ascii="JetBrains Mono" w:hAnsi="JetBrains Mono" w:eastAsia="JetBrains Mono" w:cs="JetBrains Mono"/>
+                <w:color w:val="17261F"/>
+                <w:sz w:val="16"/>
+                <w:szCs w:val="16"/>
+              </w:rPr>
+              <w:t xml:space="preserve">  valid --&gt;|"Sí"| owner{"¿El cultivo es suyo?&lt;br/&gt;CropService.getOwned"}</w:t>
+            </w:r>
+          </w:p>
+          <w:p>
+            <w:pPr>
+              <w:spacing w:before="0" w:after="0" w:line="252" w:lineRule="auto"/>
+            </w:pPr>
+            <w:r>
+              <w:rPr>
+                <w:rFonts w:ascii="JetBrains Mono" w:hAnsi="JetBrains Mono" w:eastAsia="JetBrains Mono" w:cs="JetBrains Mono"/>
+                <w:color w:val="17261F"/>
+                <w:sz w:val="16"/>
+                <w:szCs w:val="16"/>
+              </w:rPr>
+              <w:t xml:space="preserve">  owner --&gt;|"No o no existe"| r404["404: no revela qué ids existen"]</w:t>
+            </w:r>
+          </w:p>
+          <w:p>
+            <w:pPr>
+              <w:spacing w:before="0" w:after="0" w:line="252" w:lineRule="auto"/>
+            </w:pPr>
+            <w:r>
+              <w:rPr>
+                <w:rFonts w:ascii="JetBrains Mono" w:hAnsi="JetBrains Mono" w:eastAsia="JetBrains Mono" w:cs="JetBrains Mono"/>
+                <w:color w:val="17261F"/>
+                <w:sz w:val="16"/>
+                <w:szCs w:val="16"/>
+              </w:rPr>
+              <w:t xml:space="preserve">  owner --&gt;|"Sí"| kind{"¿La ruta aplica a su tipo?&lt;br/&gt;device solo reales · virtual-device solo virtuales"}</w:t>
+            </w:r>
+          </w:p>
+          <w:p>
+            <w:pPr>
+              <w:spacing w:before="0" w:after="0" w:line="252" w:lineRule="auto"/>
+            </w:pPr>
+            <w:r>
+              <w:rPr>
+                <w:rFonts w:ascii="JetBrains Mono" w:hAnsi="JetBrains Mono" w:eastAsia="JetBrains Mono" w:cs="JetBrains Mono"/>
+                <w:color w:val="17261F"/>
+                <w:sz w:val="16"/>
+                <w:szCs w:val="16"/>
+              </w:rPr>
+              <w:t xml:space="preserve">  kind --&gt;|"No"| r400b["400 con el motivo"]</w:t>
+            </w:r>
+          </w:p>
+          <w:p>
+            <w:pPr>
+              <w:spacing w:before="0" w:after="0" w:line="252" w:lineRule="auto"/>
+            </w:pPr>
+            <w:r>
+              <w:rPr>
+                <w:rFonts w:ascii="JetBrains Mono" w:hAnsi="JetBrains Mono" w:eastAsia="JetBrains Mono" w:cs="JetBrains Mono"/>
+                <w:color w:val="17261F"/>
+                <w:sz w:val="16"/>
+                <w:szCs w:val="16"/>
+              </w:rPr>
+              <w:t xml:space="preserve">  kind --&gt;|"Sí"| ok(["Servicio y respuesta JSON"])</w:t>
+            </w:r>
+          </w:p>
+          <w:p>
+            <w:pPr>
+              <w:spacing w:before="0" w:after="0" w:line="252" w:lineRule="auto"/>
+            </w:pPr>
+            <w:r>
+              <w:rPr>
+                <w:rFonts w:ascii="JetBrains Mono" w:hAnsi="JetBrains Mono" w:eastAsia="JetBrains Mono" w:cs="JetBrains Mono"/>
+                <w:color w:val="17261F"/>
+                <w:sz w:val="16"/>
+                <w:szCs w:val="16"/>
+              </w:rPr>
+              <w:t xml:space="preserve">  classDef leaf fill:#DDF5EA,stroke:#067A52,color:#17261F</w:t>
+            </w:r>
+          </w:p>
+          <w:p>
+            <w:pPr>
+              <w:spacing w:before="0" w:after="0" w:line="252" w:lineRule="auto"/>
+            </w:pPr>
+            <w:r>
+              <w:rPr>
+                <w:rFonts w:ascii="JetBrains Mono" w:hAnsi="JetBrains Mono" w:eastAsia="JetBrains Mono" w:cs="JetBrains Mono"/>
+                <w:color w:val="17261F"/>
+                <w:sz w:val="16"/>
+                <w:szCs w:val="16"/>
+              </w:rPr>
+              <w:t xml:space="preserve">  classDef water fill:#E3F2FB,stroke:#1F6FA0,color:#17261F</w:t>
+            </w:r>
+          </w:p>
+          <w:p>
+            <w:pPr>
+              <w:spacing w:before="0" w:after="0" w:line="252" w:lineRule="auto"/>
+            </w:pPr>
+            <w:r>
+              <w:rPr>
+                <w:rFonts w:ascii="JetBrains Mono" w:hAnsi="JetBrains Mono" w:eastAsia="JetBrains Mono" w:cs="JetBrains Mono"/>
+                <w:color w:val="17261F"/>
+                <w:sz w:val="16"/>
+                <w:szCs w:val="16"/>
+              </w:rPr>
+              <w:t xml:space="preserve">  classDef sun fill:#FDF4DD,stroke:#C98D12,color:#17261F</w:t>
+            </w:r>
+          </w:p>
+          <w:p>
+            <w:pPr>
+              <w:spacing w:before="0" w:after="0" w:line="252" w:lineRule="auto"/>
+            </w:pPr>
+            <w:r>
+              <w:rPr>
+                <w:rFonts w:ascii="JetBrains Mono" w:hAnsi="JetBrains Mono" w:eastAsia="JetBrains Mono" w:cs="JetBrains Mono"/>
+                <w:color w:val="17261F"/>
+                <w:sz w:val="16"/>
+                <w:szCs w:val="16"/>
+              </w:rPr>
+              <w:t xml:space="preserve">  classDef clay fill:#FBE9E1,stroke:#B85A38,color:#17261F</w:t>
+            </w:r>
+          </w:p>
+          <w:p>
+            <w:pPr>
+              <w:spacing w:before="0" w:after="0" w:line="252" w:lineRule="auto"/>
+            </w:pPr>
+            <w:r>
+              <w:rPr>
+                <w:rFonts w:ascii="JetBrains Mono" w:hAnsi="JetBrains Mono" w:eastAsia="JetBrains Mono" w:cs="JetBrains Mono"/>
+                <w:color w:val="17261F"/>
+                <w:sz w:val="16"/>
+                <w:szCs w:val="16"/>
+              </w:rPr>
+              <w:t xml:space="preserve">  classDef core fill:#067A52,stroke:#0B3D2B,color:#FFFFFF</w:t>
+            </w:r>
+          </w:p>
+          <w:p>
+            <w:pPr>
+              <w:spacing w:before="0" w:after="0" w:line="252" w:lineRule="auto"/>
+            </w:pPr>
+            <w:r>
+              <w:rPr>
+                <w:rFonts w:ascii="JetBrains Mono" w:hAnsi="JetBrains Mono" w:eastAsia="JetBrains Mono" w:cs="JetBrains Mono"/>
+                <w:color w:val="17261F"/>
+                <w:sz w:val="16"/>
+                <w:szCs w:val="16"/>
+              </w:rPr>
+              <w:t xml:space="preserve">  classDef deep fill:#0B3D2B,stroke:#06281C,color:#FFFFFF</w:t>
+            </w:r>
+          </w:p>
+          <w:p>
+            <w:pPr>
+              <w:spacing w:before="0" w:after="0" w:line="252" w:lineRule="auto"/>
+            </w:pPr>
+            <w:r>
+              <w:rPr>
+                <w:rFonts w:ascii="JetBrains Mono" w:hAnsi="JetBrains Mono" w:eastAsia="JetBrains Mono" w:cs="JetBrains Mono"/>
+                <w:color w:val="17261F"/>
+                <w:sz w:val="16"/>
+                <w:szCs w:val="16"/>
+              </w:rPr>
+              <w:t xml:space="preserve">  classDef muted fill:#F2F7F4,stroke:#5B6B63,color:#17261F</w:t>
+            </w:r>
+          </w:p>
+          <w:p>
+            <w:pPr>
+              <w:spacing w:before="0" w:after="0" w:line="252" w:lineRule="auto"/>
+            </w:pPr>
+            <w:r>
+              <w:rPr>
+                <w:rFonts w:ascii="JetBrains Mono" w:hAnsi="JetBrains Mono" w:eastAsia="JetBrains Mono" w:cs="JetBrains Mono"/>
+                <w:color w:val="17261F"/>
+                <w:sz w:val="16"/>
+                <w:szCs w:val="16"/>
+              </w:rPr>
+              <w:t xml:space="preserve">  class req,ok core</w:t>
+            </w:r>
+          </w:p>
+          <w:p>
+            <w:pPr>
+              <w:spacing w:before="0" w:after="0" w:line="252" w:lineRule="auto"/>
+            </w:pPr>
+            <w:r>
+              <w:rPr>
+                <w:rFonts w:ascii="JetBrains Mono" w:hAnsi="JetBrains Mono" w:eastAsia="JetBrains Mono" w:cs="JetBrains Mono"/>
+                <w:color w:val="17261F"/>
+                <w:sz w:val="16"/>
+                <w:szCs w:val="16"/>
+              </w:rPr>
+              <w:t xml:space="preserve">  class cors,rate,pub,jwt,valid,owner,kind sun</w:t>
+            </w:r>
+          </w:p>
+          <w:p>
+            <w:pPr>
+              <w:spacing w:before="0" w:after="0" w:line="252" w:lineRule="auto"/>
+            </w:pPr>
+            <w:r>
+              <w:rPr>
+                <w:rFonts w:ascii="JetBrains Mono" w:hAnsi="JetBrains Mono" w:eastAsia="JetBrains Mono" w:cs="JetBrains Mono"/>
+                <w:color w:val="17261F"/>
+                <w:sz w:val="16"/>
+                <w:szCs w:val="16"/>
+              </w:rPr>
+              <w:t xml:space="preserve">  class r403,r429,r401,r400,r404,r400b clay</w:t>
+            </w:r>
+          </w:p>
+          <w:p>
+            <w:pPr>
+              <w:spacing w:before="0" w:after="0" w:line="252" w:lineRule="auto"/>
+            </w:pPr>
+            <w:r>
+              <w:rPr>
+                <w:rFonts w:ascii="JetBrains Mono" w:hAnsi="JetBrains Mono" w:eastAsia="JetBrains Mono" w:cs="JetBrains Mono"/>
+                <w:color w:val="17261F"/>
+                <w:sz w:val="16"/>
+                <w:szCs w:val="16"/>
+              </w:rPr>
+              <w:t xml:space="preserve">  class ctrl leaf</w:t>
+            </w:r>
+          </w:p>
+        </w:tc>
+      </w:tr>
+    </w:tbl>
+    <w:p>
+      <w:pPr>
+        <w:spacing w:before="160" w:after="0" w:line="240" w:lineRule="auto"/>
+        <w:rPr>
+          <w:sz w:val="8"/>
+        </w:rPr>
+      </w:pPr>
+    </w:p>
+    <w:p>
+      <w:pPr>
         <w:keepNext/>
         <w:spacing w:before="60" w:after="0" w:line="240" w:lineRule="auto"/>
         <w:rPr>
@@ -5367,8 +7951,8 @@
         <w:tblLook w:val="04A0" w:firstRow="1" w:firstColumn="1" w:noVBand="1"/>
       </w:tblPr>
       <w:tblGrid>
-        <w:gridCol w:w="1813"/>
-        <w:gridCol w:w="7547"/>
+        <w:gridCol w:w="1729"/>
+        <w:gridCol w:w="7631"/>
       </w:tblGrid>
       <w:tr>
         <w:trPr>
@@ -5377,7 +7961,7 @@
         </w:trPr>
         <w:tc>
           <w:tcPr>
-            <w:tcW w:w="1813" w:type="dxa"/>
+            <w:tcW w:w="1729" w:type="dxa"/>
             <w:shd w:val="clear" w:color="auto" w:fill="0B3D2B"/>
             <w:tcMar>
               <w:top w:w="70" w:type="dxa"/>
@@ -5406,7 +7990,7 @@
         </w:tc>
         <w:tc>
           <w:tcPr>
-            <w:tcW w:w="7547" w:type="dxa"/>
+            <w:tcW w:w="7631" w:type="dxa"/>
             <w:shd w:val="clear" w:color="auto" w:fill="0B3D2B"/>
             <w:tcMar>
               <w:top w:w="70" w:type="dxa"/>
@@ -5440,7 +8024,7 @@
         </w:trPr>
         <w:tc>
           <w:tcPr>
-            <w:tcW w:w="1813" w:type="dxa"/>
+            <w:tcW w:w="1729" w:type="dxa"/>
             <w:shd w:val="clear" w:color="auto" w:fill="FFFFFF"/>
             <w:tcMar>
               <w:top w:w="70" w:type="dxa"/>
@@ -5468,7 +8052,7 @@
         </w:tc>
         <w:tc>
           <w:tcPr>
-            <w:tcW w:w="7547" w:type="dxa"/>
+            <w:tcW w:w="7631" w:type="dxa"/>
             <w:shd w:val="clear" w:color="auto" w:fill="FFFFFF"/>
             <w:tcMar>
               <w:top w:w="70" w:type="dxa"/>
@@ -5534,7 +8118,7 @@
         </w:trPr>
         <w:tc>
           <w:tcPr>
-            <w:tcW w:w="1813" w:type="dxa"/>
+            <w:tcW w:w="1729" w:type="dxa"/>
             <w:shd w:val="clear" w:color="auto" w:fill="F2F7F4"/>
             <w:tcMar>
               <w:top w:w="70" w:type="dxa"/>
@@ -5562,7 +8146,7 @@
         </w:tc>
         <w:tc>
           <w:tcPr>
-            <w:tcW w:w="7547" w:type="dxa"/>
+            <w:tcW w:w="7631" w:type="dxa"/>
             <w:shd w:val="clear" w:color="auto" w:fill="F2F7F4"/>
             <w:tcMar>
               <w:top w:w="70" w:type="dxa"/>
@@ -5635,6 +8219,23 @@
                 <w:szCs w:val="15"/>
               </w:rPr>
               <w:t xml:space="preserve">/crops/{id}/device</w:t>
+            </w:r>
+            <w:r>
+              <w:rPr>
+                <w:color w:val="17261F"/>
+                <w:sz w:val="17"/>
+                <w:szCs w:val="17"/>
+              </w:rPr>
+              <w:t xml:space="preserve">, </w:t>
+            </w:r>
+            <w:r>
+              <w:rPr>
+                <w:rFonts w:ascii="JetBrains Mono" w:hAnsi="JetBrains Mono" w:eastAsia="JetBrains Mono" w:cs="JetBrains Mono"/>
+                <w:color w:val="0A5A3C"/>
+                <w:sz w:val="15"/>
+                <w:szCs w:val="15"/>
+              </w:rPr>
+              <w:t xml:space="preserve">/crops/{id}/weather</w:t>
             </w:r>
           </w:p>
         </w:tc>
@@ -5645,7 +8246,7 @@
         </w:trPr>
         <w:tc>
           <w:tcPr>
-            <w:tcW w:w="1813" w:type="dxa"/>
+            <w:tcW w:w="1729" w:type="dxa"/>
             <w:shd w:val="clear" w:color="auto" w:fill="FFFFFF"/>
             <w:tcMar>
               <w:top w:w="70" w:type="dxa"/>
@@ -5673,7 +8274,7 @@
         </w:tc>
         <w:tc>
           <w:tcPr>
-            <w:tcW w:w="7547" w:type="dxa"/>
+            <w:tcW w:w="7631" w:type="dxa"/>
             <w:shd w:val="clear" w:color="auto" w:fill="FFFFFF"/>
             <w:tcMar>
               <w:top w:w="70" w:type="dxa"/>
@@ -5763,6 +8364,23 @@
                 <w:szCs w:val="15"/>
               </w:rPr>
               <w:t xml:space="preserve">/virtual-device</w:t>
+            </w:r>
+            <w:r>
+              <w:rPr>
+                <w:color w:val="17261F"/>
+                <w:sz w:val="17"/>
+                <w:szCs w:val="17"/>
+              </w:rPr>
+              <w:t xml:space="preserve">, </w:t>
+            </w:r>
+            <w:r>
+              <w:rPr>
+                <w:rFonts w:ascii="JetBrains Mono" w:hAnsi="JetBrains Mono" w:eastAsia="JetBrains Mono" w:cs="JetBrains Mono"/>
+                <w:color w:val="0A5A3C"/>
+                <w:sz w:val="15"/>
+                <w:szCs w:val="15"/>
+              </w:rPr>
+              <w:t xml:space="preserve">/channels</w:t>
             </w:r>
           </w:p>
         </w:tc>
@@ -5773,7 +8391,7 @@
         </w:trPr>
         <w:tc>
           <w:tcPr>
-            <w:tcW w:w="1813" w:type="dxa"/>
+            <w:tcW w:w="1729" w:type="dxa"/>
             <w:shd w:val="clear" w:color="auto" w:fill="F2F7F4"/>
             <w:tcMar>
               <w:top w:w="70" w:type="dxa"/>
@@ -5801,7 +8419,7 @@
         </w:tc>
         <w:tc>
           <w:tcPr>
-            <w:tcW w:w="7547" w:type="dxa"/>
+            <w:tcW w:w="7631" w:type="dxa"/>
             <w:shd w:val="clear" w:color="auto" w:fill="F2F7F4"/>
             <w:tcMar>
               <w:top w:w="70" w:type="dxa"/>
@@ -7388,7 +10006,7 @@
           <w:sz w:val="20"/>
           <w:szCs w:val="20"/>
         </w:rPr>
-        <w:t xml:space="preserve"> corre 118 pruebas con JUnit y Mockito: cifrado, JWT, contraseñas, tópicos y telemetría MQTT, aprovisionamiento, comandos, cultivos con su tipo fijo y su forma, el agente, el envío de lecturas para el aprendizaje (solo reales), canales y bot de Telegram, la simulación de los virtuales (dueño, clave, límites, pausa y reconciliación), el completado de cultivos anteriores, la caché con respaldo local y la cadena de seguridad de los controladores. El E2E central de </w:t>
+        <w:t xml:space="preserve"> corre 147 pruebas con JUnit y Mockito: cifrado, JWT, contraseñas, tópicos y telemetría MQTT, aprovisionamiento, comandos y switches, cultivos con su tipo fijo, su forma, su lugar y su clima, los avisos por cultivo, el agente, el envío de lecturas para el aprendizaje ( solo reales), canales y bot de Telegram, la simulación de los virtuales (dueño, clave, límites, pausa y reconciliación), el completado de cultivos anteriores, la caché con respaldo local y la cadena de seguridad de los controladores. El E2E central de </w:t>
       </w:r>
       <w:r>
         <w:rPr>
@@ -7405,7 +10023,7 @@
           <w:sz w:val="20"/>
           <w:szCs w:val="20"/>
         </w:rPr>
-        <w:t xml:space="preserve"> recorre la API completa con 35 comprobaciones.</w:t>
+        <w:t xml:space="preserve"> recorre la API completa con 46 comprobaciones.</w:t>
       </w:r>
     </w:p>
     <w:p>
@@ -8141,7 +10759,7 @@
               <w:sz w:val="14"/>
               <w:szCs w:val="14"/>
             </w:rPr>
-            <w:t xml:space="preserve">SMARTPOT-API · V1.0</w:t>
+            <w:t xml:space="preserve">SMARTPOT-API · V1.1</w:t>
           </w:r>
         </w:p>
       </w:tc>

</xml_diff>